<commit_message>
feat: remoção dos espaços vazios
</commit_message>
<xml_diff>
--- a/Modelos/definitivos/Comercial/modelos/Proposta técnica.docx
+++ b/Modelos/definitivos/Comercial/modelos/Proposta técnica.docx
@@ -1,6 +1,6 @@
 
 <file path=word/document.xml><?xml version="1.0" encoding="utf-8"?>
-<w:document xmlns:wpc="http://schemas.microsoft.com/office/word/2010/wordprocessingCanvas" xmlns:cx="http://schemas.microsoft.com/office/drawing/2014/chartex" xmlns:cx1="http://schemas.microsoft.com/office/drawing/2015/9/8/chartex" xmlns:cx2="http://schemas.microsoft.com/office/drawing/2015/10/21/chartex" xmlns:cx3="http://schemas.microsoft.com/office/drawing/2016/5/9/chartex" xmlns:cx4="http://schemas.microsoft.com/office/drawing/2016/5/10/chartex" xmlns:cx5="http://schemas.microsoft.com/office/drawing/2016/5/11/chartex" xmlns:cx6="http://schemas.microsoft.com/office/drawing/2016/5/12/chartex" xmlns:cx7="http://schemas.microsoft.com/office/drawing/2016/5/13/chartex" xmlns:cx8="http://schemas.microsoft.com/office/drawing/2016/5/14/chartex" xmlns:mc="http://schemas.openxmlformats.org/markup-compatibility/2006" xmlns:aink="http://schemas.microsoft.com/office/drawing/2016/ink" xmlns:am3d="http://schemas.microsoft.com/office/drawing/2017/model3d" xmlns:o="urn:schemas-microsoft-com:office:office" xmlns:oel="http://schemas.microsoft.com/office/2019/extlst" xmlns:r="http://schemas.openxmlformats.org/officeDocument/2006/relationships" xmlns:m="http://schemas.openxmlformats.org/officeDocument/2006/math" xmlns:v="urn:schemas-microsoft-com:vml" xmlns:wp14="http://schemas.microsoft.com/office/word/2010/wordprocessingDrawing" xmlns:wp="http://schemas.openxmlformats.org/drawingml/2006/wordprocessingDrawing" xmlns:w10="urn:schemas-microsoft-com:office:word" xmlns:w="http://schemas.openxmlformats.org/wordprocessingml/2006/main" xmlns:w14="http://schemas.microsoft.com/office/word/2010/wordml" xmlns:w15="http://schemas.microsoft.com/office/word/2012/wordml" xmlns:w16cei="http://schemas.microsoft.com/office/word/2026/wordml/cei" xmlns:w16cex="http://schemas.microsoft.com/office/word/2018/wordml/cex" xmlns:w16cid="http://schemas.microsoft.com/office/word/2016/wordml/cid" xmlns:w16="http://schemas.microsoft.com/office/word/2018/wordml" xmlns:w16du="http://schemas.microsoft.com/office/word/2023/wordml/word16du" xmlns:w16sdtdh="http://schemas.microsoft.com/office/word/2020/wordml/sdtdatahash" xmlns:w16sdtfl="http://schemas.microsoft.com/office/word/2024/wordml/sdtformatlock" xmlns:w16se="http://schemas.microsoft.com/office/word/2015/wordml/symex" xmlns:wpg="http://schemas.microsoft.com/office/word/2010/wordprocessingGroup" xmlns:wpi="http://schemas.microsoft.com/office/word/2010/wordprocessingInk" xmlns:wne="http://schemas.microsoft.com/office/word/2006/wordml" xmlns:wps="http://schemas.microsoft.com/office/word/2010/wordprocessingShape" mc:Ignorable="w14 w15 w16se w16cid w16 w16cex w16sdtdh w16sdtfl w16du wp14">
+<w:document xmlns:wpc="http://schemas.microsoft.com/office/word/2010/wordprocessingCanvas" xmlns:cx="http://schemas.microsoft.com/office/drawing/2014/chartex" xmlns:cx1="http://schemas.microsoft.com/office/drawing/2015/9/8/chartex" xmlns:cx2="http://schemas.microsoft.com/office/drawing/2015/10/21/chartex" xmlns:cx3="http://schemas.microsoft.com/office/drawing/2016/5/9/chartex" xmlns:cx4="http://schemas.microsoft.com/office/drawing/2016/5/10/chartex" xmlns:cx5="http://schemas.microsoft.com/office/drawing/2016/5/11/chartex" xmlns:cx6="http://schemas.microsoft.com/office/drawing/2016/5/12/chartex" xmlns:cx7="http://schemas.microsoft.com/office/drawing/2016/5/13/chartex" xmlns:cx8="http://schemas.microsoft.com/office/drawing/2016/5/14/chartex" xmlns:mc="http://schemas.openxmlformats.org/markup-compatibility/2006" xmlns:aink="http://schemas.microsoft.com/office/drawing/2016/ink" xmlns:am3d="http://schemas.microsoft.com/office/drawing/2017/model3d" xmlns:o="urn:schemas-microsoft-com:office:office" xmlns:oel="http://schemas.microsoft.com/office/2019/extlst" xmlns:r="http://schemas.openxmlformats.org/officeDocument/2006/relationships" xmlns:m="http://schemas.openxmlformats.org/officeDocument/2006/math" xmlns:v="urn:schemas-microsoft-com:vml" xmlns:wp14="http://schemas.microsoft.com/office/word/2010/wordprocessingDrawing" xmlns:wp="http://schemas.openxmlformats.org/drawingml/2006/wordprocessingDrawing" xmlns:w10="urn:schemas-microsoft-com:office:word" xmlns:w="http://schemas.openxmlformats.org/wordprocessingml/2006/main" xmlns:w14="http://schemas.microsoft.com/office/word/2010/wordml" xmlns:w15="http://schemas.microsoft.com/office/word/2012/wordml" xmlns:w16cex="http://schemas.microsoft.com/office/word/2018/wordml/cex" xmlns:w16cid="http://schemas.microsoft.com/office/word/2016/wordml/cid" xmlns:w16="http://schemas.microsoft.com/office/word/2018/wordml" xmlns:w16du="http://schemas.microsoft.com/office/word/2023/wordml/word16du" xmlns:w16sdtdh="http://schemas.microsoft.com/office/word/2020/wordml/sdtdatahash" xmlns:w16sdtfl="http://schemas.microsoft.com/office/word/2024/wordml/sdtformatlock" xmlns:w16se="http://schemas.microsoft.com/office/word/2015/wordml/symex" xmlns:wpg="http://schemas.microsoft.com/office/word/2010/wordprocessingGroup" xmlns:wpi="http://schemas.microsoft.com/office/word/2010/wordprocessingInk" xmlns:wne="http://schemas.microsoft.com/office/word/2006/wordml" xmlns:wps="http://schemas.microsoft.com/office/word/2010/wordprocessingShape" mc:Ignorable="w14 w15 w16se w16cid w16 w16cex w16sdtdh w16sdtfl w16du wp14">
   <w:body>
     <w:p>
       <w:pPr>
@@ -149,7 +149,7 @@
               </wp:anchor>
             </w:drawing>
           </mc:Choice>
-          <mc:Fallback>
+          <mc:Fallback xmlns:w16cei="http://schemas.microsoft.com/office/word/2026/wordml/cei">
             <w:pict>
               <v:shapetype w14:anchorId="579A0571" id="_x0000_t202" coordsize="21600,21600" o:spt="202" path="m,l,21600r21600,l21600,xe">
                 <v:stroke joinstyle="miter"/>
@@ -772,7 +772,7 @@
           <w:sz w:val="24"/>
           <w:szCs w:val="24"/>
         </w:rPr>
-        <w:t xml:space="preserve">{{nome_vendedor}}</w:t>
+        <w:t>{{nome_vendedor}}</w:t>
       </w:r>
     </w:p>
     <w:p>
@@ -805,7 +805,7 @@
           <w:sz w:val="24"/>
           <w:szCs w:val="24"/>
         </w:rPr>
-        <w:t xml:space="preserve">{{elaborador_proposta}}</w:t>
+        <w:t>{{elaborador_proposta}}</w:t>
       </w:r>
     </w:p>
     <w:p>
@@ -855,7 +855,7 @@
           <w:sz w:val="24"/>
           <w:szCs w:val="24"/>
         </w:rPr>
-        <w:t xml:space="preserve">{{cod_prop}}</w:t>
+        <w:t>{{cod_prop}}</w:t>
       </w:r>
       <w:r>
         <w:rPr>
@@ -884,7 +884,7 @@
           <w:sz w:val="20"/>
           <w:szCs w:val="20"/>
         </w:rPr>
-        <w:t xml:space="preserve">{{n_rev}}</w:t>
+        <w:t>{{n_rev}}</w:t>
       </w:r>
     </w:p>
     <w:p>
@@ -920,7 +920,7 @@
           <w:sz w:val="24"/>
           <w:szCs w:val="24"/>
         </w:rPr>
-        <w:t xml:space="preserve">{{nome_cliente}}</w:t>
+        <w:t>{{nome_cliente}}</w:t>
       </w:r>
     </w:p>
     <w:p>
@@ -950,7 +950,7 @@
           <w:sz w:val="24"/>
           <w:szCs w:val="24"/>
         </w:rPr>
-        <w:t xml:space="preserve">{{contato_cliente}}</w:t>
+        <w:t>{{contato_cliente}}</w:t>
       </w:r>
     </w:p>
     <w:p>
@@ -980,7 +980,7 @@
           <w:sz w:val="24"/>
           <w:szCs w:val="24"/>
         </w:rPr>
-        <w:t xml:space="preserve">{{email_cliente}}</w:t>
+        <w:t>{{email_cliente}}</w:t>
       </w:r>
     </w:p>
     <w:p>
@@ -1010,7 +1010,7 @@
           <w:sz w:val="24"/>
           <w:szCs w:val="24"/>
         </w:rPr>
-        <w:t xml:space="preserve">{{dpto_solicitante}}</w:t>
+        <w:t>{{dpto_solicitante}}</w:t>
       </w:r>
     </w:p>
     <w:p>
@@ -1066,7 +1066,7 @@
           <w:sz w:val="24"/>
           <w:szCs w:val="24"/>
         </w:rPr>
-        <w:t xml:space="preserve">{{local_obra}}</w:t>
+        <w:t>{{local_obra}}</w:t>
       </w:r>
     </w:p>
     <w:p>
@@ -1115,7 +1115,7 @@
           <w:sz w:val="24"/>
           <w:szCs w:val="24"/>
         </w:rPr>
-        <w:t xml:space="preserve">{{cnpj_texto}}</w:t>
+        <w:t>{{cnpj_texto}}</w:t>
       </w:r>
     </w:p>
     <w:bookmarkEnd w:id="0"/>
@@ -1811,6 +1811,7 @@
           <w:sz w:val="20"/>
           <w:szCs w:val="20"/>
         </w:rPr>
+        <w:lastRenderedPageBreak/>
         <w:t>Filtrovali é a escolha certa</w:t>
       </w:r>
       <w:r>
@@ -1936,7 +1937,7 @@
               </wp:anchor>
             </w:drawing>
           </mc:Choice>
-          <mc:Fallback>
+          <mc:Fallback xmlns:w16cei="http://schemas.microsoft.com/office/word/2026/wordml/cei">
             <w:pict>
               <v:shape w14:anchorId="0DC6BF25" id="_x0000_s1027" type="#_x0000_t202" style="position:absolute;left:0;text-align:left;margin-left:409.65pt;margin-top:87.95pt;width:102.6pt;height:54.6pt;z-index:-251630592;visibility:visible;mso-wrap-style:square;mso-width-percent:0;mso-height-percent:0;mso-wrap-distance-left:9pt;mso-wrap-distance-top:3.6pt;mso-wrap-distance-right:9pt;mso-wrap-distance-bottom:3.6pt;mso-position-horizontal:absolute;mso-position-horizontal-relative:text;mso-position-vertical:absolute;mso-position-vertical-relative:text;mso-width-percent:0;mso-height-percent:0;mso-width-relative:margin;mso-height-relative:margin;v-text-anchor:top" o:gfxdata="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" filled="f" stroked="f">
                 <v:textbox>
@@ -2066,7 +2067,7 @@
               </wp:anchor>
             </w:drawing>
           </mc:Choice>
-          <mc:Fallback>
+          <mc:Fallback xmlns:w16cei="http://schemas.microsoft.com/office/word/2026/wordml/cei">
             <w:pict>
               <v:shape w14:anchorId="319DD6DB" id="_x0000_s1028" type="#_x0000_t202" style="position:absolute;left:0;text-align:left;margin-left:317.25pt;margin-top:87.95pt;width:102.6pt;height:54.6pt;z-index:-251631616;visibility:visible;mso-wrap-style:square;mso-width-percent:0;mso-height-percent:0;mso-wrap-distance-left:9pt;mso-wrap-distance-top:3.6pt;mso-wrap-distance-right:9pt;mso-wrap-distance-bottom:3.6pt;mso-position-horizontal:absolute;mso-position-horizontal-relative:text;mso-position-vertical:absolute;mso-position-vertical-relative:text;mso-width-percent:0;mso-height-percent:0;mso-width-relative:margin;mso-height-relative:margin;v-text-anchor:top" o:gfxdata="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" filled="f" stroked="f">
                 <v:textbox>
@@ -2196,7 +2197,7 @@
               </wp:anchor>
             </w:drawing>
           </mc:Choice>
-          <mc:Fallback>
+          <mc:Fallback xmlns:w16cei="http://schemas.microsoft.com/office/word/2026/wordml/cei">
             <w:pict>
               <v:shape w14:anchorId="67BB42D4" id="_x0000_s1029" type="#_x0000_t202" style="position:absolute;left:0;text-align:left;margin-left:223.05pt;margin-top:87.95pt;width:102.6pt;height:54.6pt;z-index:-251632640;visibility:visible;mso-wrap-style:square;mso-width-percent:0;mso-height-percent:0;mso-wrap-distance-left:9pt;mso-wrap-distance-top:3.6pt;mso-wrap-distance-right:9pt;mso-wrap-distance-bottom:3.6pt;mso-position-horizontal:absolute;mso-position-horizontal-relative:text;mso-position-vertical:absolute;mso-position-vertical-relative:text;mso-width-percent:0;mso-height-percent:0;mso-width-relative:margin;mso-height-relative:margin;v-text-anchor:top" o:gfxdata="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" filled="f" stroked="f">
                 <v:textbox>
@@ -2310,7 +2311,7 @@
               </wp:anchor>
             </w:drawing>
           </mc:Choice>
-          <mc:Fallback>
+          <mc:Fallback xmlns:w16cei="http://schemas.microsoft.com/office/word/2026/wordml/cei">
             <w:pict>
               <v:shape w14:anchorId="0CD975BB" id="_x0000_s1030" type="#_x0000_t202" style="position:absolute;left:0;text-align:left;margin-left:117.45pt;margin-top:87.95pt;width:102.6pt;height:54.6pt;z-index:-251633664;visibility:visible;mso-wrap-style:square;mso-width-percent:0;mso-height-percent:0;mso-wrap-distance-left:9pt;mso-wrap-distance-top:3.6pt;mso-wrap-distance-right:9pt;mso-wrap-distance-bottom:3.6pt;mso-position-horizontal:absolute;mso-position-horizontal-relative:text;mso-position-vertical:absolute;mso-position-vertical-relative:text;mso-width-percent:0;mso-height-percent:0;mso-width-relative:margin;mso-height-relative:margin;v-text-anchor:top" o:gfxdata="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" filled="f" stroked="f">
                 <v:textbox>
@@ -2504,7 +2505,7 @@
               </wp:anchor>
             </w:drawing>
           </mc:Choice>
-          <mc:Fallback>
+          <mc:Fallback xmlns:w16cei="http://schemas.microsoft.com/office/word/2026/wordml/cei">
             <w:pict>
               <v:shape w14:anchorId="708A2AAD" id="_x0000_s1031" type="#_x0000_t202" style="position:absolute;left:0;text-align:left;margin-left:29.85pt;margin-top:76.45pt;width:76.8pt;height:34.8pt;z-index:-251634688;visibility:visible;mso-wrap-style:square;mso-width-percent:0;mso-height-percent:0;mso-wrap-distance-left:9pt;mso-wrap-distance-top:3.6pt;mso-wrap-distance-right:9pt;mso-wrap-distance-bottom:3.6pt;mso-position-horizontal:absolute;mso-position-horizontal-relative:text;mso-position-vertical:absolute;mso-position-vertical-relative:text;mso-width-percent:0;mso-height-percent:0;mso-width-relative:margin;mso-height-relative:margin;v-text-anchor:top" o:gfxdata="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" filled="f" stroked="f">
                 <v:textbox>
@@ -3827,7 +3828,7 @@
           <w:sz w:val="20"/>
           <w:szCs w:val="20"/>
         </w:rPr>
-        <w:t xml:space="preserve">{{servico}}</w:t>
+        <w:t>{{servico}}</w:t>
       </w:r>
     </w:p>
     <w:p>
@@ -3843,97 +3844,6 @@
       <w:r>
         <w:t>{{escopo_blocos}}</w:t>
       </w:r>
-    </w:p>
-    <w:p>
-      <w:pPr>
-        <w:pStyle w:val="PargrafodaLista"/>
-        <w:spacing w:after="0" w:line="240" w:lineRule="auto"/>
-        <w:ind w:left="1068"/>
-        <w:jc w:val="both"/>
-      </w:pPr>
-    </w:p>
-    <w:p>
-      <w:pPr>
-        <w:pStyle w:val="PargrafodaLista"/>
-        <w:spacing w:after="0" w:line="240" w:lineRule="auto"/>
-        <w:ind w:left="1068"/>
-        <w:jc w:val="both"/>
-      </w:pPr>
-    </w:p>
-    <w:p>
-      <w:pPr>
-        <w:pStyle w:val="PargrafodaLista"/>
-        <w:rPr>
-          <w:rFonts w:ascii="Arial" w:hAnsi="Arial" w:cs="Arial"/>
-          <w:sz w:val="20"/>
-          <w:szCs w:val="20"/>
-        </w:rPr>
-      </w:pPr>
-    </w:p>
-    <w:p>
-      <w:pPr>
-        <w:pStyle w:val="PargrafodaLista"/>
-        <w:rPr>
-          <w:rFonts w:ascii="Arial" w:hAnsi="Arial" w:cs="Arial"/>
-          <w:sz w:val="20"/>
-          <w:szCs w:val="20"/>
-        </w:rPr>
-      </w:pPr>
-    </w:p>
-    <w:p>
-      <w:pPr>
-        <w:pStyle w:val="PargrafodaLista"/>
-        <w:rPr>
-          <w:rFonts w:ascii="Arial" w:hAnsi="Arial" w:cs="Arial"/>
-          <w:sz w:val="20"/>
-          <w:szCs w:val="20"/>
-        </w:rPr>
-      </w:pPr>
-    </w:p>
-    <w:p>
-      <w:pPr>
-        <w:pStyle w:val="PargrafodaLista"/>
-        <w:rPr>
-          <w:rFonts w:ascii="Arial" w:hAnsi="Arial" w:cs="Arial"/>
-          <w:sz w:val="20"/>
-          <w:szCs w:val="20"/>
-        </w:rPr>
-      </w:pPr>
-    </w:p>
-    <w:p>
-      <w:pPr>
-        <w:pStyle w:val="PargrafodaLista"/>
-        <w:rPr>
-          <w:rFonts w:ascii="Arial" w:hAnsi="Arial" w:cs="Arial"/>
-          <w:sz w:val="20"/>
-          <w:szCs w:val="20"/>
-        </w:rPr>
-      </w:pPr>
-    </w:p>
-    <w:p>
-      <w:pPr>
-        <w:pStyle w:val="PargrafodaLista"/>
-        <w:rPr>
-          <w:rFonts w:ascii="Arial" w:hAnsi="Arial" w:cs="Arial"/>
-          <w:sz w:val="20"/>
-          <w:szCs w:val="20"/>
-        </w:rPr>
-      </w:pPr>
-    </w:p>
-    <w:p>
-      <w:pPr>
-        <w:pStyle w:val="PargrafodaLista"/>
-        <w:rPr>
-          <w:rFonts w:ascii="Arial" w:hAnsi="Arial" w:cs="Arial"/>
-          <w:sz w:val="20"/>
-          <w:szCs w:val="20"/>
-        </w:rPr>
-      </w:pPr>
-    </w:p>
-    <w:p>
-      <w:pPr>
-        <w:pStyle w:val="PargrafodaLista"/>
-      </w:pPr>
     </w:p>
     <w:p>
       <w:pPr>
@@ -4281,7 +4191,7 @@
                 <w:szCs w:val="16"/>
                 <w:lang w:eastAsia="pt-BR"/>
               </w:rPr>
-              <w:t xml:space="preserve">{{categoria_filtrovali}}</w:t>
+              <w:t>{{categoria_filtrovali}}</w:t>
             </w:r>
           </w:p>
         </w:tc>
@@ -4354,27 +4264,7 @@
                 <w:szCs w:val="16"/>
                 <w:lang w:eastAsia="pt-BR"/>
               </w:rPr>
-              <w:t xml:space="preserve">{{escopo_filtrovali}}</w:t>
-            </w:r>
-            <w:r>
-              <w:rPr>
-                <w:rFonts w:ascii="Arial" w:eastAsia="Arial" w:hAnsi="Arial" w:cs="Arial"/>
-                <w:color w:val="000000"/>
-                <w:sz w:val="16"/>
-                <w:szCs w:val="16"/>
-                <w:lang w:eastAsia="pt-BR"/>
-              </w:rPr>
-              <w:t/>
-            </w:r>
-            <w:r>
-              <w:rPr>
-                <w:rFonts w:ascii="Arial" w:eastAsia="Arial" w:hAnsi="Arial" w:cs="Arial"/>
-                <w:color w:val="000000"/>
-                <w:sz w:val="16"/>
-                <w:szCs w:val="16"/>
-                <w:lang w:eastAsia="pt-BR"/>
-              </w:rPr>
-              <w:t/>
+              <w:t>{{escopo_filtrovali}}</w:t>
             </w:r>
           </w:p>
         </w:tc>
@@ -4410,7 +4300,7 @@
                 <w:szCs w:val="16"/>
                 <w:lang w:eastAsia="pt-BR"/>
               </w:rPr>
-              <w:t xml:space="preserve">{{nota_filtrovali}}</w:t>
+              <w:t>{{nota_filtrovali}}</w:t>
             </w:r>
           </w:p>
         </w:tc>
@@ -4651,7 +4541,7 @@
                 <w:szCs w:val="16"/>
                 <w:lang w:eastAsia="pt-BR"/>
               </w:rPr>
-              <w:t xml:space="preserve">{{categoria_contratante}}</w:t>
+              <w:t>{{categoria_contratante}}</w:t>
             </w:r>
           </w:p>
         </w:tc>
@@ -4722,16 +4612,7 @@
                 <w:szCs w:val="16"/>
                 <w:lang w:eastAsia="pt-BR"/>
               </w:rPr>
-              <w:t xml:space="preserve">{{escopo_contratante}}</w:t>
-            </w:r>
-            <w:r>
-              <w:rPr>
-                <w:rFonts w:ascii="Arial" w:hAnsi="Arial" w:cs="Arial"/>
-                <w:sz w:val="16"/>
-                <w:szCs w:val="16"/>
-                <w:lang w:eastAsia="pt-BR"/>
-              </w:rPr>
-              <w:t/>
+              <w:t>{{escopo_contratante}}</w:t>
             </w:r>
           </w:p>
         </w:tc>
@@ -4767,7 +4648,7 @@
                 <w:szCs w:val="16"/>
                 <w:lang w:eastAsia="pt-BR"/>
               </w:rPr>
-              <w:t xml:space="preserve">{{nota_contratante}}</w:t>
+              <w:t>{{nota_contratante}}</w:t>
             </w:r>
           </w:p>
         </w:tc>
@@ -4917,7 +4798,7 @@
           <w:sz w:val="20"/>
           <w:szCs w:val="20"/>
         </w:rPr>
-        <w:t xml:space="preserve">{{prev_atende}}</w:t>
+        <w:t>{{prev_atende}}</w:t>
       </w:r>
       <w:r>
         <w:rPr>
@@ -5117,7 +4998,7 @@
           <w:sz w:val="20"/>
           <w:szCs w:val="20"/>
         </w:rPr>
-        <w:t xml:space="preserve">{{n_dias}}</w:t>
+        <w:t>{{n_dias}}</w:t>
       </w:r>
       <w:r>
         <w:rPr>
@@ -5161,7 +5042,7 @@
           <w:sz w:val="20"/>
           <w:szCs w:val="20"/>
         </w:rPr>
-        <w:t xml:space="preserve">{{dias_treinamento}}</w:t>
+        <w:t>{{dias_treinamento}}</w:t>
       </w:r>
       <w:r>
         <w:rPr>
@@ -5205,7 +5086,7 @@
           <w:sz w:val="20"/>
           <w:szCs w:val="20"/>
         </w:rPr>
-        <w:t xml:space="preserve">{{n_dias_trabalhados}}</w:t>
+        <w:t>{{n_dias_trabalhados}}</w:t>
       </w:r>
       <w:r>
         <w:rPr>
@@ -5249,7 +5130,7 @@
           <w:sz w:val="20"/>
           <w:szCs w:val="20"/>
         </w:rPr>
-        <w:t xml:space="preserve">{{dias_mob}}</w:t>
+        <w:t>{{dias_mob}}</w:t>
       </w:r>
       <w:r>
         <w:rPr>
@@ -5606,31 +5487,31 @@
           <w:sz w:val="20"/>
           <w:szCs w:val="20"/>
         </w:rPr>
+        <w:t>Objetivo;</w:t>
+      </w:r>
+    </w:p>
+    <w:p>
+      <w:pPr>
+        <w:pStyle w:val="PargrafodaLista"/>
+        <w:autoSpaceDE w:val="0"/>
+        <w:autoSpaceDN w:val="0"/>
+        <w:adjustRightInd w:val="0"/>
+        <w:spacing w:after="0" w:line="240" w:lineRule="auto"/>
+        <w:ind w:left="708" w:firstLine="348"/>
+        <w:jc w:val="both"/>
+        <w:rPr>
+          <w:rFonts w:ascii="Arial" w:hAnsi="Arial" w:cs="Arial"/>
+          <w:sz w:val="20"/>
+          <w:szCs w:val="20"/>
+        </w:rPr>
+      </w:pPr>
+      <w:r>
+        <w:rPr>
+          <w:rFonts w:ascii="Arial" w:hAnsi="Arial" w:cs="Arial"/>
+          <w:sz w:val="20"/>
+          <w:szCs w:val="20"/>
+        </w:rPr>
         <w:lastRenderedPageBreak/>
-        <w:t>Objetivo;</w:t>
-      </w:r>
-    </w:p>
-    <w:p>
-      <w:pPr>
-        <w:pStyle w:val="PargrafodaLista"/>
-        <w:autoSpaceDE w:val="0"/>
-        <w:autoSpaceDN w:val="0"/>
-        <w:adjustRightInd w:val="0"/>
-        <w:spacing w:after="0" w:line="240" w:lineRule="auto"/>
-        <w:ind w:left="708" w:firstLine="348"/>
-        <w:jc w:val="both"/>
-        <w:rPr>
-          <w:rFonts w:ascii="Arial" w:hAnsi="Arial" w:cs="Arial"/>
-          <w:sz w:val="20"/>
-          <w:szCs w:val="20"/>
-        </w:rPr>
-      </w:pPr>
-      <w:r>
-        <w:rPr>
-          <w:rFonts w:ascii="Arial" w:hAnsi="Arial" w:cs="Arial"/>
-          <w:sz w:val="20"/>
-          <w:szCs w:val="20"/>
-        </w:rPr>
         <w:t xml:space="preserve">Garantir a partida dos equipamentos hidráulicos e de lubrificação dentro das normas NAS ou ISO, através da eliminação de contaminantes a base de óleo, graxas, óxidos de ferro, carepas de laminação e borras de soldas livres do interior das tubulações, com o emprego de soluções químicas inibidas e compatíveis com aços carbono e inoxidável.   </w:t>
       </w:r>
     </w:p>
@@ -6741,39 +6622,15 @@
           <w:sz w:val="20"/>
           <w:szCs w:val="20"/>
         </w:rPr>
-        <w:t xml:space="preserve">O flushing com água consiste em injetar água em uma tubulação através do método circulação pressurizada com pressão e vazão adequada para atingir o </w:t>
-      </w:r>
-      <w:r>
-        <w:rPr>
-          <w:rFonts w:ascii="Arial" w:hAnsi="Arial" w:cs="Arial"/>
-          <w:sz w:val="20"/>
-          <w:szCs w:val="20"/>
-        </w:rPr>
-        <w:t>regime turbulento</w:t>
-      </w:r>
-      <w:r>
-        <w:rPr>
-          <w:rFonts w:ascii="Arial" w:hAnsi="Arial" w:cs="Arial"/>
-          <w:sz w:val="20"/>
-          <w:szCs w:val="20"/>
-        </w:rPr>
-        <w:t xml:space="preserve"> gerando arraste. O objetivo é deixar o sistema adequado para uso removendo os particulados sólidos livres no interior da tubulação. </w:t>
-      </w:r>
-      <w:r>
-        <w:rPr>
-          <w:rFonts w:ascii="Arial" w:hAnsi="Arial" w:cs="Arial"/>
-          <w:sz w:val="20"/>
-          <w:szCs w:val="20"/>
-        </w:rPr>
-        <w:t>Para a retenção do particulado sólido serão utilizados filtros absolutos</w:t>
-      </w:r>
-      <w:r>
-        <w:rPr>
-          <w:rFonts w:ascii="Arial" w:hAnsi="Arial" w:cs="Arial"/>
-          <w:sz w:val="20"/>
-          <w:szCs w:val="20"/>
-        </w:rPr>
-        <w:t xml:space="preserve"> bag no retorno da linha ou em um sistema de filtragem acoplado no reservatório do equipamento de flushing.</w:t>
+        <w:t xml:space="preserve">O flushing com água consiste em injetar água em uma tubulação através do método circulação pressurizada com pressão e vazão adequada para atingir o regime turbulento gerando arraste. O objetivo é deixar o sistema adequado para uso removendo os particulados sólidos livres no interior da tubulação. </w:t>
+      </w:r>
+      <w:r>
+        <w:rPr>
+          <w:rFonts w:ascii="Arial" w:hAnsi="Arial" w:cs="Arial"/>
+          <w:sz w:val="20"/>
+          <w:szCs w:val="20"/>
+        </w:rPr>
+        <w:t>Para a retenção do particulado sólido serão utilizados filtros absolutos bag no retorno da linha ou em um sistema de filtragem acoplado no reservatório do equipamento de flushing.</w:t>
       </w:r>
     </w:p>
     <w:p>
@@ -6866,15 +6723,7 @@
           <w:sz w:val="20"/>
           <w:szCs w:val="20"/>
         </w:rPr>
-        <w:t xml:space="preserve">Critério de aceitação: </w:t>
-      </w:r>
-      <w:r>
-        <w:rPr>
-          <w:rFonts w:ascii="Arial" w:hAnsi="Arial" w:cs="Arial"/>
-          <w:sz w:val="20"/>
-          <w:szCs w:val="20"/>
-        </w:rPr>
-        <w:t xml:space="preserve">interior da tubulação isenta de resíduos sólidos </w:t>
+        <w:t xml:space="preserve">Critério de aceitação: interior da tubulação isenta de resíduos sólidos </w:t>
       </w:r>
     </w:p>
     <w:p>
@@ -8343,25 +8192,7 @@
           <w:sz w:val="20"/>
           <w:szCs w:val="20"/>
         </w:rPr>
-        <w:t xml:space="preserve">Nota: Quando aplicado o processo em óleos usados e ou com coloração escura no qual impeça a leitura através do contador de partículas a laser, neste caso </w:t>
-      </w:r>
-      <w:proofErr w:type="gramStart"/>
-      <w:r>
-        <w:rPr>
-          <w:rFonts w:ascii="Arial" w:hAnsi="Arial" w:cs="Arial"/>
-          <w:sz w:val="20"/>
-          <w:szCs w:val="20"/>
-        </w:rPr>
-        <w:t>o mesmo</w:t>
-      </w:r>
-      <w:proofErr w:type="gramEnd"/>
-      <w:r>
-        <w:rPr>
-          <w:rFonts w:ascii="Arial" w:hAnsi="Arial" w:cs="Arial"/>
-          <w:sz w:val="20"/>
-          <w:szCs w:val="20"/>
-        </w:rPr>
-        <w:t xml:space="preserve"> circulará por pelo menos 2 horas a depender do volume do óleo e não havendo a saturação do elemento filtrante será considerado como liberado.</w:t>
+        <w:t>Nota: Quando aplicado o processo em óleos usados e ou com coloração escura no qual impeça a leitura através do contador de partículas a laser, neste caso o mesmo circulará por pelo menos 2 horas a depender do volume do óleo e não havendo a saturação do elemento filtrante será considerado como liberado.</w:t>
       </w:r>
     </w:p>
     <w:p>
@@ -10774,15 +10605,7 @@
           <w:sz w:val="20"/>
           <w:szCs w:val="20"/>
         </w:rPr>
-        <w:t>específicas das atividades, bem como, as imagens do antes e depois de alguns pontos da estrutura</w:t>
-      </w:r>
-      <w:r>
-        <w:rPr>
-          <w:rFonts w:ascii="Arial" w:hAnsi="Arial" w:cs="Arial"/>
-          <w:sz w:val="20"/>
-          <w:szCs w:val="20"/>
-        </w:rPr>
-        <w:t>.</w:t>
+        <w:t>específicas das atividades, bem como, as imagens do antes e depois de alguns pontos da estrutura.</w:t>
       </w:r>
     </w:p>
     <w:p>
@@ -10888,7 +10711,7 @@
           <w:sz w:val="20"/>
           <w:szCs w:val="20"/>
         </w:rPr>
-        <w:t xml:space="preserve">{{validadeProp}}</w:t>
+        <w:t>{{validadeProp}}</w:t>
       </w:r>
       <w:r>
         <w:rPr>
@@ -11001,7 +10824,6 @@
           <w:sz w:val="20"/>
           <w:szCs w:val="20"/>
         </w:rPr>
-        <w:lastRenderedPageBreak/>
         <w:t xml:space="preserve">No caso de prorrogação de prazo conforme item </w:t>
       </w:r>
       <w:r>
@@ -11152,7 +10974,7 @@
 </file>
 
 <file path=word/endnotes.xml><?xml version="1.0" encoding="utf-8"?>
-<w:endnotes xmlns:wpc="http://schemas.microsoft.com/office/word/2010/wordprocessingCanvas" xmlns:cx="http://schemas.microsoft.com/office/drawing/2014/chartex" xmlns:cx1="http://schemas.microsoft.com/office/drawing/2015/9/8/chartex" xmlns:cx2="http://schemas.microsoft.com/office/drawing/2015/10/21/chartex" xmlns:cx3="http://schemas.microsoft.com/office/drawing/2016/5/9/chartex" xmlns:cx4="http://schemas.microsoft.com/office/drawing/2016/5/10/chartex" xmlns:cx5="http://schemas.microsoft.com/office/drawing/2016/5/11/chartex" xmlns:cx6="http://schemas.microsoft.com/office/drawing/2016/5/12/chartex" xmlns:cx7="http://schemas.microsoft.com/office/drawing/2016/5/13/chartex" xmlns:cx8="http://schemas.microsoft.com/office/drawing/2016/5/14/chartex" xmlns:mc="http://schemas.openxmlformats.org/markup-compatibility/2006" xmlns:aink="http://schemas.microsoft.com/office/drawing/2016/ink" xmlns:am3d="http://schemas.microsoft.com/office/drawing/2017/model3d" xmlns:o="urn:schemas-microsoft-com:office:office" xmlns:oel="http://schemas.microsoft.com/office/2019/extlst" xmlns:r="http://schemas.openxmlformats.org/officeDocument/2006/relationships" xmlns:m="http://schemas.openxmlformats.org/officeDocument/2006/math" xmlns:v="urn:schemas-microsoft-com:vml" xmlns:wp14="http://schemas.microsoft.com/office/word/2010/wordprocessingDrawing" xmlns:wp="http://schemas.openxmlformats.org/drawingml/2006/wordprocessingDrawing" xmlns:w10="urn:schemas-microsoft-com:office:word" xmlns:w="http://schemas.openxmlformats.org/wordprocessingml/2006/main" xmlns:w14="http://schemas.microsoft.com/office/word/2010/wordml" xmlns:w15="http://schemas.microsoft.com/office/word/2012/wordml" xmlns:w16cei="http://schemas.microsoft.com/office/word/2026/wordml/cei" xmlns:w16cex="http://schemas.microsoft.com/office/word/2018/wordml/cex" xmlns:w16cid="http://schemas.microsoft.com/office/word/2016/wordml/cid" xmlns:w16="http://schemas.microsoft.com/office/word/2018/wordml" xmlns:w16du="http://schemas.microsoft.com/office/word/2023/wordml/word16du" xmlns:w16sdtdh="http://schemas.microsoft.com/office/word/2020/wordml/sdtdatahash" xmlns:w16sdtfl="http://schemas.microsoft.com/office/word/2024/wordml/sdtformatlock" xmlns:w16se="http://schemas.microsoft.com/office/word/2015/wordml/symex" xmlns:wpg="http://schemas.microsoft.com/office/word/2010/wordprocessingGroup" xmlns:wpi="http://schemas.microsoft.com/office/word/2010/wordprocessingInk" xmlns:wne="http://schemas.microsoft.com/office/word/2006/wordml" xmlns:wps="http://schemas.microsoft.com/office/word/2010/wordprocessingShape" mc:Ignorable="w14 w15 w16se w16cid w16 w16cex w16sdtdh w16sdtfl w16du wp14">
+<w:endnotes xmlns:wpc="http://schemas.microsoft.com/office/word/2010/wordprocessingCanvas" xmlns:cx="http://schemas.microsoft.com/office/drawing/2014/chartex" xmlns:cx1="http://schemas.microsoft.com/office/drawing/2015/9/8/chartex" xmlns:cx2="http://schemas.microsoft.com/office/drawing/2015/10/21/chartex" xmlns:cx3="http://schemas.microsoft.com/office/drawing/2016/5/9/chartex" xmlns:cx4="http://schemas.microsoft.com/office/drawing/2016/5/10/chartex" xmlns:cx5="http://schemas.microsoft.com/office/drawing/2016/5/11/chartex" xmlns:cx6="http://schemas.microsoft.com/office/drawing/2016/5/12/chartex" xmlns:cx7="http://schemas.microsoft.com/office/drawing/2016/5/13/chartex" xmlns:cx8="http://schemas.microsoft.com/office/drawing/2016/5/14/chartex" xmlns:mc="http://schemas.openxmlformats.org/markup-compatibility/2006" xmlns:aink="http://schemas.microsoft.com/office/drawing/2016/ink" xmlns:am3d="http://schemas.microsoft.com/office/drawing/2017/model3d" xmlns:o="urn:schemas-microsoft-com:office:office" xmlns:oel="http://schemas.microsoft.com/office/2019/extlst" xmlns:r="http://schemas.openxmlformats.org/officeDocument/2006/relationships" xmlns:m="http://schemas.openxmlformats.org/officeDocument/2006/math" xmlns:v="urn:schemas-microsoft-com:vml" xmlns:wp14="http://schemas.microsoft.com/office/word/2010/wordprocessingDrawing" xmlns:wp="http://schemas.openxmlformats.org/drawingml/2006/wordprocessingDrawing" xmlns:w10="urn:schemas-microsoft-com:office:word" xmlns:w="http://schemas.openxmlformats.org/wordprocessingml/2006/main" xmlns:w14="http://schemas.microsoft.com/office/word/2010/wordml" xmlns:w15="http://schemas.microsoft.com/office/word/2012/wordml" xmlns:w16cex="http://schemas.microsoft.com/office/word/2018/wordml/cex" xmlns:w16cid="http://schemas.microsoft.com/office/word/2016/wordml/cid" xmlns:w16="http://schemas.microsoft.com/office/word/2018/wordml" xmlns:w16du="http://schemas.microsoft.com/office/word/2023/wordml/word16du" xmlns:w16sdtdh="http://schemas.microsoft.com/office/word/2020/wordml/sdtdatahash" xmlns:w16sdtfl="http://schemas.microsoft.com/office/word/2024/wordml/sdtformatlock" xmlns:w16se="http://schemas.microsoft.com/office/word/2015/wordml/symex" xmlns:wpg="http://schemas.microsoft.com/office/word/2010/wordprocessingGroup" xmlns:wpi="http://schemas.microsoft.com/office/word/2010/wordprocessingInk" xmlns:wne="http://schemas.microsoft.com/office/word/2006/wordml" xmlns:wps="http://schemas.microsoft.com/office/word/2010/wordprocessingShape" mc:Ignorable="w14 w15 w16se w16cid w16 w16cex w16sdtdh w16sdtfl w16du wp14">
   <w:endnote w:type="separator" w:id="-1">
     <w:p>
       <w:pPr>
@@ -11177,7 +10999,7 @@
 </file>
 
 <file path=word/footer1.xml><?xml version="1.0" encoding="utf-8"?>
-<w:ftr xmlns:wpc="http://schemas.microsoft.com/office/word/2010/wordprocessingCanvas" xmlns:cx="http://schemas.microsoft.com/office/drawing/2014/chartex" xmlns:cx1="http://schemas.microsoft.com/office/drawing/2015/9/8/chartex" xmlns:cx2="http://schemas.microsoft.com/office/drawing/2015/10/21/chartex" xmlns:cx3="http://schemas.microsoft.com/office/drawing/2016/5/9/chartex" xmlns:cx4="http://schemas.microsoft.com/office/drawing/2016/5/10/chartex" xmlns:cx5="http://schemas.microsoft.com/office/drawing/2016/5/11/chartex" xmlns:cx6="http://schemas.microsoft.com/office/drawing/2016/5/12/chartex" xmlns:cx7="http://schemas.microsoft.com/office/drawing/2016/5/13/chartex" xmlns:cx8="http://schemas.microsoft.com/office/drawing/2016/5/14/chartex" xmlns:mc="http://schemas.openxmlformats.org/markup-compatibility/2006" xmlns:aink="http://schemas.microsoft.com/office/drawing/2016/ink" xmlns:am3d="http://schemas.microsoft.com/office/drawing/2017/model3d" xmlns:o="urn:schemas-microsoft-com:office:office" xmlns:oel="http://schemas.microsoft.com/office/2019/extlst" xmlns:r="http://schemas.openxmlformats.org/officeDocument/2006/relationships" xmlns:m="http://schemas.openxmlformats.org/officeDocument/2006/math" xmlns:v="urn:schemas-microsoft-com:vml" xmlns:wp14="http://schemas.microsoft.com/office/word/2010/wordprocessingDrawing" xmlns:wp="http://schemas.openxmlformats.org/drawingml/2006/wordprocessingDrawing" xmlns:w10="urn:schemas-microsoft-com:office:word" xmlns:w="http://schemas.openxmlformats.org/wordprocessingml/2006/main" xmlns:w14="http://schemas.microsoft.com/office/word/2010/wordml" xmlns:w15="http://schemas.microsoft.com/office/word/2012/wordml" xmlns:w16cei="http://schemas.microsoft.com/office/word/2026/wordml/cei" xmlns:w16cex="http://schemas.microsoft.com/office/word/2018/wordml/cex" xmlns:w16cid="http://schemas.microsoft.com/office/word/2016/wordml/cid" xmlns:w16="http://schemas.microsoft.com/office/word/2018/wordml" xmlns:w16du="http://schemas.microsoft.com/office/word/2023/wordml/word16du" xmlns:w16sdtdh="http://schemas.microsoft.com/office/word/2020/wordml/sdtdatahash" xmlns:w16sdtfl="http://schemas.microsoft.com/office/word/2024/wordml/sdtformatlock" xmlns:w16se="http://schemas.microsoft.com/office/word/2015/wordml/symex" xmlns:wpg="http://schemas.microsoft.com/office/word/2010/wordprocessingGroup" xmlns:wpi="http://schemas.microsoft.com/office/word/2010/wordprocessingInk" xmlns:wne="http://schemas.microsoft.com/office/word/2006/wordml" xmlns:wps="http://schemas.microsoft.com/office/word/2010/wordprocessingShape" mc:Ignorable="w14 w15 w16se w16cid w16 w16cex w16sdtdh w16sdtfl w16du wp14">
+<w:ftr xmlns:wpc="http://schemas.microsoft.com/office/word/2010/wordprocessingCanvas" xmlns:cx="http://schemas.microsoft.com/office/drawing/2014/chartex" xmlns:cx1="http://schemas.microsoft.com/office/drawing/2015/9/8/chartex" xmlns:cx2="http://schemas.microsoft.com/office/drawing/2015/10/21/chartex" xmlns:cx3="http://schemas.microsoft.com/office/drawing/2016/5/9/chartex" xmlns:cx4="http://schemas.microsoft.com/office/drawing/2016/5/10/chartex" xmlns:cx5="http://schemas.microsoft.com/office/drawing/2016/5/11/chartex" xmlns:cx6="http://schemas.microsoft.com/office/drawing/2016/5/12/chartex" xmlns:cx7="http://schemas.microsoft.com/office/drawing/2016/5/13/chartex" xmlns:cx8="http://schemas.microsoft.com/office/drawing/2016/5/14/chartex" xmlns:mc="http://schemas.openxmlformats.org/markup-compatibility/2006" xmlns:aink="http://schemas.microsoft.com/office/drawing/2016/ink" xmlns:am3d="http://schemas.microsoft.com/office/drawing/2017/model3d" xmlns:o="urn:schemas-microsoft-com:office:office" xmlns:oel="http://schemas.microsoft.com/office/2019/extlst" xmlns:r="http://schemas.openxmlformats.org/officeDocument/2006/relationships" xmlns:m="http://schemas.openxmlformats.org/officeDocument/2006/math" xmlns:v="urn:schemas-microsoft-com:vml" xmlns:wp14="http://schemas.microsoft.com/office/word/2010/wordprocessingDrawing" xmlns:wp="http://schemas.openxmlformats.org/drawingml/2006/wordprocessingDrawing" xmlns:w10="urn:schemas-microsoft-com:office:word" xmlns:w="http://schemas.openxmlformats.org/wordprocessingml/2006/main" xmlns:w14="http://schemas.microsoft.com/office/word/2010/wordml" xmlns:w15="http://schemas.microsoft.com/office/word/2012/wordml" xmlns:w16cex="http://schemas.microsoft.com/office/word/2018/wordml/cex" xmlns:w16cid="http://schemas.microsoft.com/office/word/2016/wordml/cid" xmlns:w16="http://schemas.microsoft.com/office/word/2018/wordml" xmlns:w16du="http://schemas.microsoft.com/office/word/2023/wordml/word16du" xmlns:w16sdtdh="http://schemas.microsoft.com/office/word/2020/wordml/sdtdatahash" xmlns:w16sdtfl="http://schemas.microsoft.com/office/word/2024/wordml/sdtformatlock" xmlns:w16se="http://schemas.microsoft.com/office/word/2015/wordml/symex" xmlns:wpg="http://schemas.microsoft.com/office/word/2010/wordprocessingGroup" xmlns:wpi="http://schemas.microsoft.com/office/word/2010/wordprocessingInk" xmlns:wne="http://schemas.microsoft.com/office/word/2006/wordml" xmlns:wps="http://schemas.microsoft.com/office/word/2010/wordprocessingShape" mc:Ignorable="w14 w15 w16se w16cid w16 w16cex w16sdtdh w16sdtfl w16du wp14">
   <w:sdt>
     <w:sdtPr>
       <w:id w:val="-1433276875"/>
@@ -11232,7 +11054,7 @@
 </file>
 
 <file path=word/footnotes.xml><?xml version="1.0" encoding="utf-8"?>
-<w:footnotes xmlns:wpc="http://schemas.microsoft.com/office/word/2010/wordprocessingCanvas" xmlns:cx="http://schemas.microsoft.com/office/drawing/2014/chartex" xmlns:cx1="http://schemas.microsoft.com/office/drawing/2015/9/8/chartex" xmlns:cx2="http://schemas.microsoft.com/office/drawing/2015/10/21/chartex" xmlns:cx3="http://schemas.microsoft.com/office/drawing/2016/5/9/chartex" xmlns:cx4="http://schemas.microsoft.com/office/drawing/2016/5/10/chartex" xmlns:cx5="http://schemas.microsoft.com/office/drawing/2016/5/11/chartex" xmlns:cx6="http://schemas.microsoft.com/office/drawing/2016/5/12/chartex" xmlns:cx7="http://schemas.microsoft.com/office/drawing/2016/5/13/chartex" xmlns:cx8="http://schemas.microsoft.com/office/drawing/2016/5/14/chartex" xmlns:mc="http://schemas.openxmlformats.org/markup-compatibility/2006" xmlns:aink="http://schemas.microsoft.com/office/drawing/2016/ink" xmlns:am3d="http://schemas.microsoft.com/office/drawing/2017/model3d" xmlns:o="urn:schemas-microsoft-com:office:office" xmlns:oel="http://schemas.microsoft.com/office/2019/extlst" xmlns:r="http://schemas.openxmlformats.org/officeDocument/2006/relationships" xmlns:m="http://schemas.openxmlformats.org/officeDocument/2006/math" xmlns:v="urn:schemas-microsoft-com:vml" xmlns:wp14="http://schemas.microsoft.com/office/word/2010/wordprocessingDrawing" xmlns:wp="http://schemas.openxmlformats.org/drawingml/2006/wordprocessingDrawing" xmlns:w10="urn:schemas-microsoft-com:office:word" xmlns:w="http://schemas.openxmlformats.org/wordprocessingml/2006/main" xmlns:w14="http://schemas.microsoft.com/office/word/2010/wordml" xmlns:w15="http://schemas.microsoft.com/office/word/2012/wordml" xmlns:w16cei="http://schemas.microsoft.com/office/word/2026/wordml/cei" xmlns:w16cex="http://schemas.microsoft.com/office/word/2018/wordml/cex" xmlns:w16cid="http://schemas.microsoft.com/office/word/2016/wordml/cid" xmlns:w16="http://schemas.microsoft.com/office/word/2018/wordml" xmlns:w16du="http://schemas.microsoft.com/office/word/2023/wordml/word16du" xmlns:w16sdtdh="http://schemas.microsoft.com/office/word/2020/wordml/sdtdatahash" xmlns:w16sdtfl="http://schemas.microsoft.com/office/word/2024/wordml/sdtformatlock" xmlns:w16se="http://schemas.microsoft.com/office/word/2015/wordml/symex" xmlns:wpg="http://schemas.microsoft.com/office/word/2010/wordprocessingGroup" xmlns:wpi="http://schemas.microsoft.com/office/word/2010/wordprocessingInk" xmlns:wne="http://schemas.microsoft.com/office/word/2006/wordml" xmlns:wps="http://schemas.microsoft.com/office/word/2010/wordprocessingShape" mc:Ignorable="w14 w15 w16se w16cid w16 w16cex w16sdtdh w16sdtfl w16du wp14">
+<w:footnotes xmlns:wpc="http://schemas.microsoft.com/office/word/2010/wordprocessingCanvas" xmlns:cx="http://schemas.microsoft.com/office/drawing/2014/chartex" xmlns:cx1="http://schemas.microsoft.com/office/drawing/2015/9/8/chartex" xmlns:cx2="http://schemas.microsoft.com/office/drawing/2015/10/21/chartex" xmlns:cx3="http://schemas.microsoft.com/office/drawing/2016/5/9/chartex" xmlns:cx4="http://schemas.microsoft.com/office/drawing/2016/5/10/chartex" xmlns:cx5="http://schemas.microsoft.com/office/drawing/2016/5/11/chartex" xmlns:cx6="http://schemas.microsoft.com/office/drawing/2016/5/12/chartex" xmlns:cx7="http://schemas.microsoft.com/office/drawing/2016/5/13/chartex" xmlns:cx8="http://schemas.microsoft.com/office/drawing/2016/5/14/chartex" xmlns:mc="http://schemas.openxmlformats.org/markup-compatibility/2006" xmlns:aink="http://schemas.microsoft.com/office/drawing/2016/ink" xmlns:am3d="http://schemas.microsoft.com/office/drawing/2017/model3d" xmlns:o="urn:schemas-microsoft-com:office:office" xmlns:oel="http://schemas.microsoft.com/office/2019/extlst" xmlns:r="http://schemas.openxmlformats.org/officeDocument/2006/relationships" xmlns:m="http://schemas.openxmlformats.org/officeDocument/2006/math" xmlns:v="urn:schemas-microsoft-com:vml" xmlns:wp14="http://schemas.microsoft.com/office/word/2010/wordprocessingDrawing" xmlns:wp="http://schemas.openxmlformats.org/drawingml/2006/wordprocessingDrawing" xmlns:w10="urn:schemas-microsoft-com:office:word" xmlns:w="http://schemas.openxmlformats.org/wordprocessingml/2006/main" xmlns:w14="http://schemas.microsoft.com/office/word/2010/wordml" xmlns:w15="http://schemas.microsoft.com/office/word/2012/wordml" xmlns:w16cex="http://schemas.microsoft.com/office/word/2018/wordml/cex" xmlns:w16cid="http://schemas.microsoft.com/office/word/2016/wordml/cid" xmlns:w16="http://schemas.microsoft.com/office/word/2018/wordml" xmlns:w16du="http://schemas.microsoft.com/office/word/2023/wordml/word16du" xmlns:w16sdtdh="http://schemas.microsoft.com/office/word/2020/wordml/sdtdatahash" xmlns:w16sdtfl="http://schemas.microsoft.com/office/word/2024/wordml/sdtformatlock" xmlns:w16se="http://schemas.microsoft.com/office/word/2015/wordml/symex" xmlns:wpg="http://schemas.microsoft.com/office/word/2010/wordprocessingGroup" xmlns:wpi="http://schemas.microsoft.com/office/word/2010/wordprocessingInk" xmlns:wne="http://schemas.microsoft.com/office/word/2006/wordml" xmlns:wps="http://schemas.microsoft.com/office/word/2010/wordprocessingShape" mc:Ignorable="w14 w15 w16se w16cid w16 w16cex w16sdtdh w16sdtfl w16du wp14">
   <w:footnote w:type="separator" w:id="-1">
     <w:p>
       <w:pPr>
@@ -11257,20 +11079,20 @@
 </file>
 
 <file path=word/header1.xml><?xml version="1.0" encoding="utf-8"?>
-<w:hdr xmlns:wpc="http://schemas.microsoft.com/office/word/2010/wordprocessingCanvas" xmlns:cx="http://schemas.microsoft.com/office/drawing/2014/chartex" xmlns:cx1="http://schemas.microsoft.com/office/drawing/2015/9/8/chartex" xmlns:cx2="http://schemas.microsoft.com/office/drawing/2015/10/21/chartex" xmlns:cx3="http://schemas.microsoft.com/office/drawing/2016/5/9/chartex" xmlns:cx4="http://schemas.microsoft.com/office/drawing/2016/5/10/chartex" xmlns:cx5="http://schemas.microsoft.com/office/drawing/2016/5/11/chartex" xmlns:cx6="http://schemas.microsoft.com/office/drawing/2016/5/12/chartex" xmlns:cx7="http://schemas.microsoft.com/office/drawing/2016/5/13/chartex" xmlns:cx8="http://schemas.microsoft.com/office/drawing/2016/5/14/chartex" xmlns:mc="http://schemas.openxmlformats.org/markup-compatibility/2006" xmlns:aink="http://schemas.microsoft.com/office/drawing/2016/ink" xmlns:am3d="http://schemas.microsoft.com/office/drawing/2017/model3d" xmlns:o="urn:schemas-microsoft-com:office:office" xmlns:oel="http://schemas.microsoft.com/office/2019/extlst" xmlns:r="http://schemas.openxmlformats.org/officeDocument/2006/relationships" xmlns:m="http://schemas.openxmlformats.org/officeDocument/2006/math" xmlns:v="urn:schemas-microsoft-com:vml" xmlns:wp14="http://schemas.microsoft.com/office/word/2010/wordprocessingDrawing" xmlns:wp="http://schemas.openxmlformats.org/drawingml/2006/wordprocessingDrawing" xmlns:w10="urn:schemas-microsoft-com:office:word" xmlns:w="http://schemas.openxmlformats.org/wordprocessingml/2006/main" xmlns:w14="http://schemas.microsoft.com/office/word/2010/wordml" xmlns:w15="http://schemas.microsoft.com/office/word/2012/wordml" xmlns:w16cei="http://schemas.microsoft.com/office/word/2026/wordml/cei" xmlns:w16cex="http://schemas.microsoft.com/office/word/2018/wordml/cex" xmlns:w16cid="http://schemas.microsoft.com/office/word/2016/wordml/cid" xmlns:w16="http://schemas.microsoft.com/office/word/2018/wordml" xmlns:w16du="http://schemas.microsoft.com/office/word/2023/wordml/word16du" xmlns:w16sdtdh="http://schemas.microsoft.com/office/word/2020/wordml/sdtdatahash" xmlns:w16sdtfl="http://schemas.microsoft.com/office/word/2024/wordml/sdtformatlock" xmlns:w16se="http://schemas.microsoft.com/office/word/2015/wordml/symex" xmlns:wpg="http://schemas.microsoft.com/office/word/2010/wordprocessingGroup" xmlns:wpi="http://schemas.microsoft.com/office/word/2010/wordprocessingInk" xmlns:wne="http://schemas.microsoft.com/office/word/2006/wordml" xmlns:wps="http://schemas.microsoft.com/office/word/2010/wordprocessingShape" mc:Ignorable="w14 w15 w16se w16cid w16 w16cex w16sdtdh w16sdtfl w16du wp14">
+<w:hdr xmlns:wpc="http://schemas.microsoft.com/office/word/2010/wordprocessingCanvas" xmlns:cx="http://schemas.microsoft.com/office/drawing/2014/chartex" xmlns:cx1="http://schemas.microsoft.com/office/drawing/2015/9/8/chartex" xmlns:cx2="http://schemas.microsoft.com/office/drawing/2015/10/21/chartex" xmlns:cx3="http://schemas.microsoft.com/office/drawing/2016/5/9/chartex" xmlns:cx4="http://schemas.microsoft.com/office/drawing/2016/5/10/chartex" xmlns:cx5="http://schemas.microsoft.com/office/drawing/2016/5/11/chartex" xmlns:cx6="http://schemas.microsoft.com/office/drawing/2016/5/12/chartex" xmlns:cx7="http://schemas.microsoft.com/office/drawing/2016/5/13/chartex" xmlns:cx8="http://schemas.microsoft.com/office/drawing/2016/5/14/chartex" xmlns:mc="http://schemas.openxmlformats.org/markup-compatibility/2006" xmlns:aink="http://schemas.microsoft.com/office/drawing/2016/ink" xmlns:am3d="http://schemas.microsoft.com/office/drawing/2017/model3d" xmlns:o="urn:schemas-microsoft-com:office:office" xmlns:oel="http://schemas.microsoft.com/office/2019/extlst" xmlns:r="http://schemas.openxmlformats.org/officeDocument/2006/relationships" xmlns:m="http://schemas.openxmlformats.org/officeDocument/2006/math" xmlns:v="urn:schemas-microsoft-com:vml" xmlns:wp14="http://schemas.microsoft.com/office/word/2010/wordprocessingDrawing" xmlns:wp="http://schemas.openxmlformats.org/drawingml/2006/wordprocessingDrawing" xmlns:w10="urn:schemas-microsoft-com:office:word" xmlns:w="http://schemas.openxmlformats.org/wordprocessingml/2006/main" xmlns:w14="http://schemas.microsoft.com/office/word/2010/wordml" xmlns:w15="http://schemas.microsoft.com/office/word/2012/wordml" xmlns:w16cex="http://schemas.microsoft.com/office/word/2018/wordml/cex" xmlns:w16cid="http://schemas.microsoft.com/office/word/2016/wordml/cid" xmlns:w16="http://schemas.microsoft.com/office/word/2018/wordml" xmlns:w16du="http://schemas.microsoft.com/office/word/2023/wordml/word16du" xmlns:w16sdtdh="http://schemas.microsoft.com/office/word/2020/wordml/sdtdatahash" xmlns:w16sdtfl="http://schemas.microsoft.com/office/word/2024/wordml/sdtformatlock" xmlns:w16se="http://schemas.microsoft.com/office/word/2015/wordml/symex" xmlns:wpg="http://schemas.microsoft.com/office/word/2010/wordprocessingGroup" xmlns:wpi="http://schemas.microsoft.com/office/word/2010/wordprocessingInk" xmlns:wne="http://schemas.microsoft.com/office/word/2006/wordml" xmlns:wps="http://schemas.microsoft.com/office/word/2010/wordprocessingShape" mc:Ignorable="w14 w15 w16se w16cid w16 w16cex w16sdtdh w16sdtfl w16du wp14">
   <w:p>
     <w:pPr>
       <w:autoSpaceDE w:val="0"/>
       <w:autoSpaceDN w:val="0"/>
       <w:adjustRightInd w:val="0"/>
       <w:spacing w:after="0" w:line="240" w:lineRule="auto"/>
+      <w:jc w:val="right"/>
       <w:rPr>
         <w:rFonts w:ascii="Arial" w:hAnsi="Arial" w:cs="Arial"/>
         <w:b/>
         <w:sz w:val="26"/>
         <w:szCs w:val="26"/>
       </w:rPr>
-      <w:jc w:val="right"/>
     </w:pPr>
     <w:r>
       <w:rPr>
@@ -11345,7 +11167,7 @@
         <w:sz w:val="20"/>
         <w:szCs w:val="20"/>
       </w:rPr>
-      <w:t xml:space="preserve">{{data_texto}}</w:t>
+      <w:t>{{data_texto}}</w:t>
     </w:r>
   </w:p>
   <w:p>
@@ -11373,7 +11195,7 @@
 </file>
 
 <file path=word/numbering.xml><?xml version="1.0" encoding="utf-8"?>
-<w:numbering xmlns:wpc="http://schemas.microsoft.com/office/word/2010/wordprocessingCanvas" xmlns:cx="http://schemas.microsoft.com/office/drawing/2014/chartex" xmlns:cx1="http://schemas.microsoft.com/office/drawing/2015/9/8/chartex" xmlns:cx2="http://schemas.microsoft.com/office/drawing/2015/10/21/chartex" xmlns:cx3="http://schemas.microsoft.com/office/drawing/2016/5/9/chartex" xmlns:cx4="http://schemas.microsoft.com/office/drawing/2016/5/10/chartex" xmlns:cx5="http://schemas.microsoft.com/office/drawing/2016/5/11/chartex" xmlns:cx6="http://schemas.microsoft.com/office/drawing/2016/5/12/chartex" xmlns:cx7="http://schemas.microsoft.com/office/drawing/2016/5/13/chartex" xmlns:cx8="http://schemas.microsoft.com/office/drawing/2016/5/14/chartex" xmlns:mc="http://schemas.openxmlformats.org/markup-compatibility/2006" xmlns:aink="http://schemas.microsoft.com/office/drawing/2016/ink" xmlns:am3d="http://schemas.microsoft.com/office/drawing/2017/model3d" xmlns:o="urn:schemas-microsoft-com:office:office" xmlns:oel="http://schemas.microsoft.com/office/2019/extlst" xmlns:r="http://schemas.openxmlformats.org/officeDocument/2006/relationships" xmlns:m="http://schemas.openxmlformats.org/officeDocument/2006/math" xmlns:v="urn:schemas-microsoft-com:vml" xmlns:wp14="http://schemas.microsoft.com/office/word/2010/wordprocessingDrawing" xmlns:wp="http://schemas.openxmlformats.org/drawingml/2006/wordprocessingDrawing" xmlns:w10="urn:schemas-microsoft-com:office:word" xmlns:w="http://schemas.openxmlformats.org/wordprocessingml/2006/main" xmlns:w14="http://schemas.microsoft.com/office/word/2010/wordml" xmlns:w15="http://schemas.microsoft.com/office/word/2012/wordml" xmlns:w16cei="http://schemas.microsoft.com/office/word/2026/wordml/cei" xmlns:w16cex="http://schemas.microsoft.com/office/word/2018/wordml/cex" xmlns:w16cid="http://schemas.microsoft.com/office/word/2016/wordml/cid" xmlns:w16="http://schemas.microsoft.com/office/word/2018/wordml" xmlns:w16du="http://schemas.microsoft.com/office/word/2023/wordml/word16du" xmlns:w16sdtdh="http://schemas.microsoft.com/office/word/2020/wordml/sdtdatahash" xmlns:w16sdtfl="http://schemas.microsoft.com/office/word/2024/wordml/sdtformatlock" xmlns:w16se="http://schemas.microsoft.com/office/word/2015/wordml/symex" xmlns:wpg="http://schemas.microsoft.com/office/word/2010/wordprocessingGroup" xmlns:wpi="http://schemas.microsoft.com/office/word/2010/wordprocessingInk" xmlns:wne="http://schemas.microsoft.com/office/word/2006/wordml" xmlns:wps="http://schemas.microsoft.com/office/word/2010/wordprocessingShape" mc:Ignorable="w14 w15 w16se w16cid w16 w16cex w16sdtdh w16sdtfl w16du wp14">
+<w:numbering xmlns:wpc="http://schemas.microsoft.com/office/word/2010/wordprocessingCanvas" xmlns:cx="http://schemas.microsoft.com/office/drawing/2014/chartex" xmlns:cx1="http://schemas.microsoft.com/office/drawing/2015/9/8/chartex" xmlns:cx2="http://schemas.microsoft.com/office/drawing/2015/10/21/chartex" xmlns:cx3="http://schemas.microsoft.com/office/drawing/2016/5/9/chartex" xmlns:cx4="http://schemas.microsoft.com/office/drawing/2016/5/10/chartex" xmlns:cx5="http://schemas.microsoft.com/office/drawing/2016/5/11/chartex" xmlns:cx6="http://schemas.microsoft.com/office/drawing/2016/5/12/chartex" xmlns:cx7="http://schemas.microsoft.com/office/drawing/2016/5/13/chartex" xmlns:cx8="http://schemas.microsoft.com/office/drawing/2016/5/14/chartex" xmlns:mc="http://schemas.openxmlformats.org/markup-compatibility/2006" xmlns:aink="http://schemas.microsoft.com/office/drawing/2016/ink" xmlns:am3d="http://schemas.microsoft.com/office/drawing/2017/model3d" xmlns:o="urn:schemas-microsoft-com:office:office" xmlns:oel="http://schemas.microsoft.com/office/2019/extlst" xmlns:r="http://schemas.openxmlformats.org/officeDocument/2006/relationships" xmlns:m="http://schemas.openxmlformats.org/officeDocument/2006/math" xmlns:v="urn:schemas-microsoft-com:vml" xmlns:wp14="http://schemas.microsoft.com/office/word/2010/wordprocessingDrawing" xmlns:wp="http://schemas.openxmlformats.org/drawingml/2006/wordprocessingDrawing" xmlns:w10="urn:schemas-microsoft-com:office:word" xmlns:w="http://schemas.openxmlformats.org/wordprocessingml/2006/main" xmlns:w14="http://schemas.microsoft.com/office/word/2010/wordml" xmlns:w15="http://schemas.microsoft.com/office/word/2012/wordml" xmlns:w16cex="http://schemas.microsoft.com/office/word/2018/wordml/cex" xmlns:w16cid="http://schemas.microsoft.com/office/word/2016/wordml/cid" xmlns:w16="http://schemas.microsoft.com/office/word/2018/wordml" xmlns:w16du="http://schemas.microsoft.com/office/word/2023/wordml/word16du" xmlns:w16sdtdh="http://schemas.microsoft.com/office/word/2020/wordml/sdtdatahash" xmlns:w16sdtfl="http://schemas.microsoft.com/office/word/2024/wordml/sdtformatlock" xmlns:w16se="http://schemas.microsoft.com/office/word/2015/wordml/symex" xmlns:wpg="http://schemas.microsoft.com/office/word/2010/wordprocessingGroup" xmlns:wpi="http://schemas.microsoft.com/office/word/2010/wordprocessingInk" xmlns:wne="http://schemas.microsoft.com/office/word/2006/wordml" xmlns:wps="http://schemas.microsoft.com/office/word/2010/wordprocessingShape" mc:Ignorable="w14 w15 w16se w16cid w16 w16cex w16sdtdh w16sdtfl w16du wp14">
   <w:abstractNum w:abstractNumId="0" w15:restartNumberingAfterBreak="0">
     <w:nsid w:val="067270B8"/>
     <w:multiLevelType w:val="hybridMultilevel"/>
@@ -13069,10 +12891,6 @@
 </file>
 
 <file path=customXml/item1.xml><?xml version="1.0" encoding="utf-8"?>
-<b:Sources xmlns:b="http://schemas.openxmlformats.org/officeDocument/2006/bibliography" xmlns="http://schemas.openxmlformats.org/officeDocument/2006/bibliography" SelectedStyle="\APASixthEditionOfficeOnline.xsl" StyleName="APA" Version="6"/>
-</file>
-
-<file path=customXml/item2.xml><?xml version="1.0" encoding="utf-8"?>
 <ct:contentTypeSchema xmlns:ct="http://schemas.microsoft.com/office/2006/metadata/contentType" xmlns:ma="http://schemas.microsoft.com/office/2006/metadata/properties/metaAttributes" ct:_="" ma:_="" ma:contentTypeName="Documento" ma:contentTypeID="0x01010050D375E88928F94091E6FD7AA4E06D15" ma:contentTypeVersion="13" ma:contentTypeDescription="Crie um novo documento." ma:contentTypeScope="" ma:versionID="7df79d7f540b57f8739ecf349a4839bc">
   <xsd:schema xmlns:xsd="http://www.w3.org/2001/XMLSchema" xmlns:xs="http://www.w3.org/2001/XMLSchema" xmlns:p="http://schemas.microsoft.com/office/2006/metadata/properties" xmlns:ns2="5ebac46c-3801-4f50-8d40-ff19a3d08a31" xmlns:ns3="04f7cffc-3ea8-4655-aac6-2c812ca3e62f" targetNamespace="http://schemas.microsoft.com/office/2006/metadata/properties" ma:root="true" ma:fieldsID="096b32e32a0a7c12d0d47f4c83d7cab2" ns2:_="" ns3:_="">
     <xsd:import namespace="5ebac46c-3801-4f50-8d40-ff19a3d08a31"/>
@@ -13281,16 +13099,11 @@
 </ct:contentTypeSchema>
 </file>
 
-<file path=customXml/item3.xml><?xml version="1.0" encoding="utf-8"?>
-<?mso-contentType ?>
-<FormTemplates xmlns="http://schemas.microsoft.com/sharepoint/v3/contenttype/forms">
-  <Display>DocumentLibraryForm</Display>
-  <Edit>DocumentLibraryForm</Edit>
-  <New>DocumentLibraryForm</New>
-</FormTemplates>
+<file path=customXml/item2.xml><?xml version="1.0" encoding="utf-8"?>
+<b:Sources xmlns:b="http://schemas.openxmlformats.org/officeDocument/2006/bibliography" xmlns="http://schemas.openxmlformats.org/officeDocument/2006/bibliography" SelectedStyle="\APASixthEditionOfficeOnline.xsl" StyleName="APA" Version="6"/>
 </file>
 
-<file path=customXml/item4.xml><?xml version="1.0" encoding="utf-8"?>
+<file path=customXml/item3.xml><?xml version="1.0" encoding="utf-8"?>
 <p:properties xmlns:p="http://schemas.microsoft.com/office/2006/metadata/properties" xmlns:xsi="http://www.w3.org/2001/XMLSchema-instance" xmlns:pc="http://schemas.microsoft.com/office/infopath/2007/PartnerControls">
   <documentManagement>
     <lcf76f155ced4ddcb4097134ff3c332f xmlns="5ebac46c-3801-4f50-8d40-ff19a3d08a31">
@@ -13302,15 +13115,16 @@
 </p:properties>
 </file>
 
-<file path=customXml/itemProps1.xml><?xml version="1.0" encoding="utf-8"?>
-<ds:datastoreItem xmlns:ds="http://schemas.openxmlformats.org/officeDocument/2006/customXml" ds:itemID="{AB0B6225-2C28-4B59-AC07-D3905D9EBCC2}">
-  <ds:schemaRefs>
-    <ds:schemaRef ds:uri="http://schemas.openxmlformats.org/officeDocument/2006/bibliography"/>
-  </ds:schemaRefs>
-</ds:datastoreItem>
+<file path=customXml/item4.xml><?xml version="1.0" encoding="utf-8"?>
+<?mso-contentType ?>
+<FormTemplates xmlns="http://schemas.microsoft.com/sharepoint/v3/contenttype/forms">
+  <Display>DocumentLibraryForm</Display>
+  <Edit>DocumentLibraryForm</Edit>
+  <New>DocumentLibraryForm</New>
+</FormTemplates>
 </file>
 
-<file path=customXml/itemProps2.xml><?xml version="1.0" encoding="utf-8"?>
+<file path=customXml/itemProps1.xml><?xml version="1.0" encoding="utf-8"?>
 <ds:datastoreItem xmlns:ds="http://schemas.openxmlformats.org/officeDocument/2006/customXml" ds:itemID="{94A65DC0-273F-470F-8FFD-06309A34330A}">
   <ds:schemaRefs>
     <ds:schemaRef ds:uri="http://schemas.microsoft.com/office/2006/metadata/contentType"/>
@@ -13329,15 +13143,15 @@
 </ds:datastoreItem>
 </file>
 
-<file path=customXml/itemProps3.xml><?xml version="1.0" encoding="utf-8"?>
-<ds:datastoreItem xmlns:ds="http://schemas.openxmlformats.org/officeDocument/2006/customXml" ds:itemID="{A5E54D8B-0784-4B0D-BAB7-E874556CC73D}">
+<file path=customXml/itemProps2.xml><?xml version="1.0" encoding="utf-8"?>
+<ds:datastoreItem xmlns:ds="http://schemas.openxmlformats.org/officeDocument/2006/customXml" ds:itemID="{AB0B6225-2C28-4B59-AC07-D3905D9EBCC2}">
   <ds:schemaRefs>
-    <ds:schemaRef ds:uri="http://schemas.microsoft.com/sharepoint/v3/contenttype/forms"/>
+    <ds:schemaRef ds:uri="http://schemas.openxmlformats.org/officeDocument/2006/bibliography"/>
   </ds:schemaRefs>
 </ds:datastoreItem>
 </file>
 
-<file path=customXml/itemProps4.xml><?xml version="1.0" encoding="utf-8"?>
+<file path=customXml/itemProps3.xml><?xml version="1.0" encoding="utf-8"?>
 <ds:datastoreItem xmlns:ds="http://schemas.openxmlformats.org/officeDocument/2006/customXml" ds:itemID="{BDD202C9-EE0D-44AA-BA2D-EDA98CFA438C}">
   <ds:schemaRefs>
     <ds:schemaRef ds:uri="http://schemas.microsoft.com/office/2006/metadata/properties"/>
@@ -13346,4 +13160,12 @@
     <ds:schemaRef ds:uri="04f7cffc-3ea8-4655-aac6-2c812ca3e62f"/>
   </ds:schemaRefs>
 </ds:datastoreItem>
+</file>
+
+<file path=customXml/itemProps4.xml><?xml version="1.0" encoding="utf-8"?>
+<ds:datastoreItem xmlns:ds="http://schemas.openxmlformats.org/officeDocument/2006/customXml" ds:itemID="{A5E54D8B-0784-4B0D-BAB7-E874556CC73D}">
+  <ds:schemaRefs>
+    <ds:schemaRef ds:uri="http://schemas.microsoft.com/sharepoint/v3/contenttype/forms"/>
+  </ds:schemaRefs>
+</ds:datastoreItem>
 </file>
</xml_diff>

<commit_message>
fix(comercial): mesclar ajustes locais dos modelos
</commit_message>
<xml_diff>
--- a/Modelos/definitivos/Comercial/modelos/Proposta técnica.docx
+++ b/Modelos/definitivos/Comercial/modelos/Proposta técnica.docx
@@ -1,6 +1,6 @@
 
 <file path=word/document.xml><?xml version="1.0" encoding="utf-8"?>
-<w:document xmlns:wpc="http://schemas.microsoft.com/office/word/2010/wordprocessingCanvas" xmlns:cx="http://schemas.microsoft.com/office/drawing/2014/chartex" xmlns:cx1="http://schemas.microsoft.com/office/drawing/2015/9/8/chartex" xmlns:cx2="http://schemas.microsoft.com/office/drawing/2015/10/21/chartex" xmlns:cx3="http://schemas.microsoft.com/office/drawing/2016/5/9/chartex" xmlns:cx4="http://schemas.microsoft.com/office/drawing/2016/5/10/chartex" xmlns:cx5="http://schemas.microsoft.com/office/drawing/2016/5/11/chartex" xmlns:cx6="http://schemas.microsoft.com/office/drawing/2016/5/12/chartex" xmlns:cx7="http://schemas.microsoft.com/office/drawing/2016/5/13/chartex" xmlns:cx8="http://schemas.microsoft.com/office/drawing/2016/5/14/chartex" xmlns:mc="http://schemas.openxmlformats.org/markup-compatibility/2006" xmlns:aink="http://schemas.microsoft.com/office/drawing/2016/ink" xmlns:am3d="http://schemas.microsoft.com/office/drawing/2017/model3d" xmlns:o="urn:schemas-microsoft-com:office:office" xmlns:oel="http://schemas.microsoft.com/office/2019/extlst" xmlns:r="http://schemas.openxmlformats.org/officeDocument/2006/relationships" xmlns:m="http://schemas.openxmlformats.org/officeDocument/2006/math" xmlns:v="urn:schemas-microsoft-com:vml" xmlns:wp14="http://schemas.microsoft.com/office/word/2010/wordprocessingDrawing" xmlns:wp="http://schemas.openxmlformats.org/drawingml/2006/wordprocessingDrawing" xmlns:w10="urn:schemas-microsoft-com:office:word" xmlns:w="http://schemas.openxmlformats.org/wordprocessingml/2006/main" xmlns:w14="http://schemas.microsoft.com/office/word/2010/wordml" xmlns:w15="http://schemas.microsoft.com/office/word/2012/wordml" xmlns:w16cei="http://schemas.microsoft.com/office/word/2026/wordml/cei" xmlns:w16cex="http://schemas.microsoft.com/office/word/2018/wordml/cex" xmlns:w16cid="http://schemas.microsoft.com/office/word/2016/wordml/cid" xmlns:w16="http://schemas.microsoft.com/office/word/2018/wordml" xmlns:w16du="http://schemas.microsoft.com/office/word/2023/wordml/word16du" xmlns:w16sdtdh="http://schemas.microsoft.com/office/word/2020/wordml/sdtdatahash" xmlns:w16sdtfl="http://schemas.microsoft.com/office/word/2024/wordml/sdtformatlock" xmlns:w16se="http://schemas.microsoft.com/office/word/2015/wordml/symex" xmlns:wpg="http://schemas.microsoft.com/office/word/2010/wordprocessingGroup" xmlns:wpi="http://schemas.microsoft.com/office/word/2010/wordprocessingInk" xmlns:wne="http://schemas.microsoft.com/office/word/2006/wordml" xmlns:wps="http://schemas.microsoft.com/office/word/2010/wordprocessingShape" mc:Ignorable="w14 w15 w16se w16cid w16 w16cex w16sdtdh w16sdtfl w16du wp14">
+<w:document xmlns:wpc="http://schemas.microsoft.com/office/word/2010/wordprocessingCanvas" xmlns:cx="http://schemas.microsoft.com/office/drawing/2014/chartex" xmlns:cx1="http://schemas.microsoft.com/office/drawing/2015/9/8/chartex" xmlns:cx2="http://schemas.microsoft.com/office/drawing/2015/10/21/chartex" xmlns:cx3="http://schemas.microsoft.com/office/drawing/2016/5/9/chartex" xmlns:cx4="http://schemas.microsoft.com/office/drawing/2016/5/10/chartex" xmlns:cx5="http://schemas.microsoft.com/office/drawing/2016/5/11/chartex" xmlns:cx6="http://schemas.microsoft.com/office/drawing/2016/5/12/chartex" xmlns:cx7="http://schemas.microsoft.com/office/drawing/2016/5/13/chartex" xmlns:cx8="http://schemas.microsoft.com/office/drawing/2016/5/14/chartex" xmlns:mc="http://schemas.openxmlformats.org/markup-compatibility/2006" xmlns:aink="http://schemas.microsoft.com/office/drawing/2016/ink" xmlns:am3d="http://schemas.microsoft.com/office/drawing/2017/model3d" xmlns:o="urn:schemas-microsoft-com:office:office" xmlns:oel="http://schemas.microsoft.com/office/2019/extlst" xmlns:r="http://schemas.openxmlformats.org/officeDocument/2006/relationships" xmlns:m="http://schemas.openxmlformats.org/officeDocument/2006/math" xmlns:v="urn:schemas-microsoft-com:vml" xmlns:wp14="http://schemas.microsoft.com/office/word/2010/wordprocessingDrawing" xmlns:wp="http://schemas.openxmlformats.org/drawingml/2006/wordprocessingDrawing" xmlns:w10="urn:schemas-microsoft-com:office:word" xmlns:w="http://schemas.openxmlformats.org/wordprocessingml/2006/main" xmlns:w14="http://schemas.microsoft.com/office/word/2010/wordml" xmlns:w15="http://schemas.microsoft.com/office/word/2012/wordml" xmlns:w16cex="http://schemas.microsoft.com/office/word/2018/wordml/cex" xmlns:w16cid="http://schemas.microsoft.com/office/word/2016/wordml/cid" xmlns:w16="http://schemas.microsoft.com/office/word/2018/wordml" xmlns:w16du="http://schemas.microsoft.com/office/word/2023/wordml/word16du" xmlns:w16sdtdh="http://schemas.microsoft.com/office/word/2020/wordml/sdtdatahash" xmlns:w16sdtfl="http://schemas.microsoft.com/office/word/2024/wordml/sdtformatlock" xmlns:w16se="http://schemas.microsoft.com/office/word/2015/wordml/symex" xmlns:wpg="http://schemas.microsoft.com/office/word/2010/wordprocessingGroup" xmlns:wpi="http://schemas.microsoft.com/office/word/2010/wordprocessingInk" xmlns:wne="http://schemas.microsoft.com/office/word/2006/wordml" xmlns:wps="http://schemas.microsoft.com/office/word/2010/wordprocessingShape" mc:Ignorable="w14 w15 w16se w16cid w16 w16cex w16sdtdh w16sdtfl w16du wp14">
   <w:body>
     <w:p>
       <w:pPr>
@@ -149,7 +149,7 @@
               </wp:anchor>
             </w:drawing>
           </mc:Choice>
-          <mc:Fallback>
+          <mc:Fallback xmlns:w16cei="http://schemas.microsoft.com/office/word/2026/wordml/cei">
             <w:pict>
               <v:shapetype w14:anchorId="579A0571" id="_x0000_t202" coordsize="21600,21600" o:spt="202" path="m,l,21600r21600,l21600,xe">
                 <v:stroke joinstyle="miter"/>
@@ -772,7 +772,7 @@
           <w:sz w:val="24"/>
           <w:szCs w:val="24"/>
         </w:rPr>
-        <w:t xml:space="preserve">{{nome_vendedor}}</w:t>
+        <w:t>{{nome_vendedor}}</w:t>
       </w:r>
     </w:p>
     <w:p>
@@ -805,7 +805,7 @@
           <w:sz w:val="24"/>
           <w:szCs w:val="24"/>
         </w:rPr>
-        <w:t xml:space="preserve">{{elaborador_proposta}}</w:t>
+        <w:t>{{elaborador_proposta}}</w:t>
       </w:r>
     </w:p>
     <w:p>
@@ -855,7 +855,7 @@
           <w:sz w:val="24"/>
           <w:szCs w:val="24"/>
         </w:rPr>
-        <w:t xml:space="preserve">{{cod_prop}}</w:t>
+        <w:t>{{cod_prop}}</w:t>
       </w:r>
       <w:r>
         <w:rPr>
@@ -884,7 +884,7 @@
           <w:sz w:val="20"/>
           <w:szCs w:val="20"/>
         </w:rPr>
-        <w:t xml:space="preserve">{{n_rev}}</w:t>
+        <w:t>{{n_rev}}</w:t>
       </w:r>
     </w:p>
     <w:p>
@@ -920,7 +920,7 @@
           <w:sz w:val="24"/>
           <w:szCs w:val="24"/>
         </w:rPr>
-        <w:t xml:space="preserve">{{nome_cliente}}</w:t>
+        <w:t>{{nome_cliente}}</w:t>
       </w:r>
     </w:p>
     <w:p>
@@ -950,7 +950,7 @@
           <w:sz w:val="24"/>
           <w:szCs w:val="24"/>
         </w:rPr>
-        <w:t xml:space="preserve">{{contato_cliente}}</w:t>
+        <w:t>{{contato_cliente}}</w:t>
       </w:r>
     </w:p>
     <w:p>
@@ -980,7 +980,7 @@
           <w:sz w:val="24"/>
           <w:szCs w:val="24"/>
         </w:rPr>
-        <w:t xml:space="preserve">{{email_cliente}}</w:t>
+        <w:t>{{email_cliente}}</w:t>
       </w:r>
     </w:p>
     <w:p>
@@ -1010,7 +1010,7 @@
           <w:sz w:val="24"/>
           <w:szCs w:val="24"/>
         </w:rPr>
-        <w:t xml:space="preserve">{{dpto_solicitante}}</w:t>
+        <w:t>{{dpto_solicitante}}</w:t>
       </w:r>
     </w:p>
     <w:p>
@@ -1066,7 +1066,7 @@
           <w:sz w:val="24"/>
           <w:szCs w:val="24"/>
         </w:rPr>
-        <w:t xml:space="preserve">{{local_obra}}</w:t>
+        <w:t>{{local_obra}}</w:t>
       </w:r>
     </w:p>
     <w:p>
@@ -1115,7 +1115,7 @@
           <w:sz w:val="24"/>
           <w:szCs w:val="24"/>
         </w:rPr>
-        <w:t xml:space="preserve">{{cnpj_texto}}</w:t>
+        <w:t>{{cnpj_texto}}</w:t>
       </w:r>
     </w:p>
     <w:bookmarkEnd w:id="0"/>
@@ -1811,6 +1811,7 @@
           <w:sz w:val="20"/>
           <w:szCs w:val="20"/>
         </w:rPr>
+        <w:lastRenderedPageBreak/>
         <w:t>Filtrovali é a escolha certa</w:t>
       </w:r>
       <w:r>
@@ -1936,7 +1937,7 @@
               </wp:anchor>
             </w:drawing>
           </mc:Choice>
-          <mc:Fallback>
+          <mc:Fallback xmlns:w16cei="http://schemas.microsoft.com/office/word/2026/wordml/cei">
             <w:pict>
               <v:shape w14:anchorId="0DC6BF25" id="_x0000_s1027" type="#_x0000_t202" style="position:absolute;left:0;text-align:left;margin-left:409.65pt;margin-top:87.95pt;width:102.6pt;height:54.6pt;z-index:-251630592;visibility:visible;mso-wrap-style:square;mso-width-percent:0;mso-height-percent:0;mso-wrap-distance-left:9pt;mso-wrap-distance-top:3.6pt;mso-wrap-distance-right:9pt;mso-wrap-distance-bottom:3.6pt;mso-position-horizontal:absolute;mso-position-horizontal-relative:text;mso-position-vertical:absolute;mso-position-vertical-relative:text;mso-width-percent:0;mso-height-percent:0;mso-width-relative:margin;mso-height-relative:margin;v-text-anchor:top" o:gfxdata="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" filled="f" stroked="f">
                 <v:textbox>
@@ -2066,7 +2067,7 @@
               </wp:anchor>
             </w:drawing>
           </mc:Choice>
-          <mc:Fallback>
+          <mc:Fallback xmlns:w16cei="http://schemas.microsoft.com/office/word/2026/wordml/cei">
             <w:pict>
               <v:shape w14:anchorId="319DD6DB" id="_x0000_s1028" type="#_x0000_t202" style="position:absolute;left:0;text-align:left;margin-left:317.25pt;margin-top:87.95pt;width:102.6pt;height:54.6pt;z-index:-251631616;visibility:visible;mso-wrap-style:square;mso-width-percent:0;mso-height-percent:0;mso-wrap-distance-left:9pt;mso-wrap-distance-top:3.6pt;mso-wrap-distance-right:9pt;mso-wrap-distance-bottom:3.6pt;mso-position-horizontal:absolute;mso-position-horizontal-relative:text;mso-position-vertical:absolute;mso-position-vertical-relative:text;mso-width-percent:0;mso-height-percent:0;mso-width-relative:margin;mso-height-relative:margin;v-text-anchor:top" o:gfxdata="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" filled="f" stroked="f">
                 <v:textbox>
@@ -2196,7 +2197,7 @@
               </wp:anchor>
             </w:drawing>
           </mc:Choice>
-          <mc:Fallback>
+          <mc:Fallback xmlns:w16cei="http://schemas.microsoft.com/office/word/2026/wordml/cei">
             <w:pict>
               <v:shape w14:anchorId="67BB42D4" id="_x0000_s1029" type="#_x0000_t202" style="position:absolute;left:0;text-align:left;margin-left:223.05pt;margin-top:87.95pt;width:102.6pt;height:54.6pt;z-index:-251632640;visibility:visible;mso-wrap-style:square;mso-width-percent:0;mso-height-percent:0;mso-wrap-distance-left:9pt;mso-wrap-distance-top:3.6pt;mso-wrap-distance-right:9pt;mso-wrap-distance-bottom:3.6pt;mso-position-horizontal:absolute;mso-position-horizontal-relative:text;mso-position-vertical:absolute;mso-position-vertical-relative:text;mso-width-percent:0;mso-height-percent:0;mso-width-relative:margin;mso-height-relative:margin;v-text-anchor:top" o:gfxdata="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" filled="f" stroked="f">
                 <v:textbox>
@@ -2310,7 +2311,7 @@
               </wp:anchor>
             </w:drawing>
           </mc:Choice>
-          <mc:Fallback>
+          <mc:Fallback xmlns:w16cei="http://schemas.microsoft.com/office/word/2026/wordml/cei">
             <w:pict>
               <v:shape w14:anchorId="0CD975BB" id="_x0000_s1030" type="#_x0000_t202" style="position:absolute;left:0;text-align:left;margin-left:117.45pt;margin-top:87.95pt;width:102.6pt;height:54.6pt;z-index:-251633664;visibility:visible;mso-wrap-style:square;mso-width-percent:0;mso-height-percent:0;mso-wrap-distance-left:9pt;mso-wrap-distance-top:3.6pt;mso-wrap-distance-right:9pt;mso-wrap-distance-bottom:3.6pt;mso-position-horizontal:absolute;mso-position-horizontal-relative:text;mso-position-vertical:absolute;mso-position-vertical-relative:text;mso-width-percent:0;mso-height-percent:0;mso-width-relative:margin;mso-height-relative:margin;v-text-anchor:top" o:gfxdata="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" filled="f" stroked="f">
                 <v:textbox>
@@ -2504,7 +2505,7 @@
               </wp:anchor>
             </w:drawing>
           </mc:Choice>
-          <mc:Fallback>
+          <mc:Fallback xmlns:w16cei="http://schemas.microsoft.com/office/word/2026/wordml/cei">
             <w:pict>
               <v:shape w14:anchorId="708A2AAD" id="_x0000_s1031" type="#_x0000_t202" style="position:absolute;left:0;text-align:left;margin-left:29.85pt;margin-top:76.45pt;width:76.8pt;height:34.8pt;z-index:-251634688;visibility:visible;mso-wrap-style:square;mso-width-percent:0;mso-height-percent:0;mso-wrap-distance-left:9pt;mso-wrap-distance-top:3.6pt;mso-wrap-distance-right:9pt;mso-wrap-distance-bottom:3.6pt;mso-position-horizontal:absolute;mso-position-horizontal-relative:text;mso-position-vertical:absolute;mso-position-vertical-relative:text;mso-width-percent:0;mso-height-percent:0;mso-width-relative:margin;mso-height-relative:margin;v-text-anchor:top" o:gfxdata="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" filled="f" stroked="f">
                 <v:textbox>
@@ -3846,97 +3847,6 @@
     </w:p>
     <w:p>
       <w:pPr>
-        <w:pStyle w:val="PargrafodaLista"/>
-        <w:spacing w:after="0" w:line="240" w:lineRule="auto"/>
-        <w:ind w:left="1068"/>
-        <w:jc w:val="both"/>
-      </w:pPr>
-    </w:p>
-    <w:p>
-      <w:pPr>
-        <w:pStyle w:val="PargrafodaLista"/>
-        <w:spacing w:after="0" w:line="240" w:lineRule="auto"/>
-        <w:ind w:left="1068"/>
-        <w:jc w:val="both"/>
-      </w:pPr>
-    </w:p>
-    <w:p>
-      <w:pPr>
-        <w:pStyle w:val="PargrafodaLista"/>
-        <w:rPr>
-          <w:rFonts w:ascii="Arial" w:hAnsi="Arial" w:cs="Arial"/>
-          <w:sz w:val="20"/>
-          <w:szCs w:val="20"/>
-        </w:rPr>
-      </w:pPr>
-    </w:p>
-    <w:p>
-      <w:pPr>
-        <w:pStyle w:val="PargrafodaLista"/>
-        <w:rPr>
-          <w:rFonts w:ascii="Arial" w:hAnsi="Arial" w:cs="Arial"/>
-          <w:sz w:val="20"/>
-          <w:szCs w:val="20"/>
-        </w:rPr>
-      </w:pPr>
-    </w:p>
-    <w:p>
-      <w:pPr>
-        <w:pStyle w:val="PargrafodaLista"/>
-        <w:rPr>
-          <w:rFonts w:ascii="Arial" w:hAnsi="Arial" w:cs="Arial"/>
-          <w:sz w:val="20"/>
-          <w:szCs w:val="20"/>
-        </w:rPr>
-      </w:pPr>
-    </w:p>
-    <w:p>
-      <w:pPr>
-        <w:pStyle w:val="PargrafodaLista"/>
-        <w:rPr>
-          <w:rFonts w:ascii="Arial" w:hAnsi="Arial" w:cs="Arial"/>
-          <w:sz w:val="20"/>
-          <w:szCs w:val="20"/>
-        </w:rPr>
-      </w:pPr>
-    </w:p>
-    <w:p>
-      <w:pPr>
-        <w:pStyle w:val="PargrafodaLista"/>
-        <w:rPr>
-          <w:rFonts w:ascii="Arial" w:hAnsi="Arial" w:cs="Arial"/>
-          <w:sz w:val="20"/>
-          <w:szCs w:val="20"/>
-        </w:rPr>
-      </w:pPr>
-    </w:p>
-    <w:p>
-      <w:pPr>
-        <w:pStyle w:val="PargrafodaLista"/>
-        <w:rPr>
-          <w:rFonts w:ascii="Arial" w:hAnsi="Arial" w:cs="Arial"/>
-          <w:sz w:val="20"/>
-          <w:szCs w:val="20"/>
-        </w:rPr>
-      </w:pPr>
-    </w:p>
-    <w:p>
-      <w:pPr>
-        <w:pStyle w:val="PargrafodaLista"/>
-        <w:rPr>
-          <w:rFonts w:ascii="Arial" w:hAnsi="Arial" w:cs="Arial"/>
-          <w:sz w:val="20"/>
-          <w:szCs w:val="20"/>
-        </w:rPr>
-      </w:pPr>
-    </w:p>
-    <w:p>
-      <w:pPr>
-        <w:pStyle w:val="PargrafodaLista"/>
-      </w:pPr>
-    </w:p>
-    <w:p>
-      <w:pPr>
         <w:spacing w:after="0" w:line="240" w:lineRule="auto"/>
         <w:ind w:firstLine="708"/>
         <w:jc w:val="both"/>
@@ -4356,26 +4266,6 @@
               </w:rPr>
               <w:t xml:space="preserve">{{escopo_filtrovali}}</w:t>
             </w:r>
-            <w:r>
-              <w:rPr>
-                <w:rFonts w:ascii="Arial" w:eastAsia="Arial" w:hAnsi="Arial" w:cs="Arial"/>
-                <w:color w:val="000000"/>
-                <w:sz w:val="16"/>
-                <w:szCs w:val="16"/>
-                <w:lang w:eastAsia="pt-BR"/>
-              </w:rPr>
-              <w:t/>
-            </w:r>
-            <w:r>
-              <w:rPr>
-                <w:rFonts w:ascii="Arial" w:eastAsia="Arial" w:hAnsi="Arial" w:cs="Arial"/>
-                <w:color w:val="000000"/>
-                <w:sz w:val="16"/>
-                <w:szCs w:val="16"/>
-                <w:lang w:eastAsia="pt-BR"/>
-              </w:rPr>
-              <w:t/>
-            </w:r>
           </w:p>
         </w:tc>
         <w:tc>
@@ -4724,15 +4614,6 @@
               </w:rPr>
               <w:t xml:space="preserve">{{escopo_contratante}}</w:t>
             </w:r>
-            <w:r>
-              <w:rPr>
-                <w:rFonts w:ascii="Arial" w:hAnsi="Arial" w:cs="Arial"/>
-                <w:sz w:val="16"/>
-                <w:szCs w:val="16"/>
-                <w:lang w:eastAsia="pt-BR"/>
-              </w:rPr>
-              <w:t/>
-            </w:r>
           </w:p>
         </w:tc>
         <w:tc>
@@ -4779,72 +4660,6 @@
         <w:spacing w:after="0" w:line="240" w:lineRule="auto"/>
         <w:jc w:val="both"/>
         <w:rPr>
-          <w:rFonts w:ascii="Arial" w:hAnsi="Arial" w:cs="Arial"/>
-          <w:sz w:val="20"/>
-          <w:szCs w:val="20"/>
-        </w:rPr>
-      </w:pPr>
-    </w:p>
-    <w:p>
-      <w:pPr>
-        <w:spacing w:after="0" w:line="240" w:lineRule="auto"/>
-        <w:jc w:val="both"/>
-        <w:rPr>
-          <w:rFonts w:ascii="Arial" w:eastAsia="Arial" w:hAnsi="Arial"/>
-          <w:sz w:val="20"/>
-          <w:szCs w:val="20"/>
-        </w:rPr>
-      </w:pPr>
-    </w:p>
-    <w:p>
-      <w:pPr>
-        <w:spacing w:after="0" w:line="240" w:lineRule="auto"/>
-        <w:jc w:val="both"/>
-        <w:rPr>
-          <w:rFonts w:ascii="Arial" w:eastAsia="Arial" w:hAnsi="Arial"/>
-          <w:sz w:val="20"/>
-          <w:szCs w:val="20"/>
-        </w:rPr>
-      </w:pPr>
-    </w:p>
-    <w:p>
-      <w:pPr>
-        <w:spacing w:after="0" w:line="240" w:lineRule="auto"/>
-        <w:jc w:val="both"/>
-        <w:rPr>
-          <w:rFonts w:ascii="Arial" w:eastAsia="Arial" w:hAnsi="Arial"/>
-          <w:sz w:val="20"/>
-          <w:szCs w:val="20"/>
-        </w:rPr>
-      </w:pPr>
-    </w:p>
-    <w:p>
-      <w:pPr>
-        <w:spacing w:after="0" w:line="240" w:lineRule="auto"/>
-        <w:jc w:val="both"/>
-        <w:rPr>
-          <w:rFonts w:ascii="Arial" w:eastAsia="Arial" w:hAnsi="Arial"/>
-          <w:sz w:val="20"/>
-          <w:szCs w:val="20"/>
-        </w:rPr>
-      </w:pPr>
-    </w:p>
-    <w:p>
-      <w:pPr>
-        <w:spacing w:after="0" w:line="240" w:lineRule="auto"/>
-        <w:jc w:val="both"/>
-        <w:rPr>
-          <w:rFonts w:ascii="Arial" w:eastAsia="Arial" w:hAnsi="Arial"/>
-          <w:sz w:val="20"/>
-          <w:szCs w:val="20"/>
-        </w:rPr>
-      </w:pPr>
-    </w:p>
-    <w:p>
-      <w:pPr>
-        <w:spacing w:after="0" w:line="240" w:lineRule="auto"/>
-        <w:jc w:val="both"/>
-        <w:rPr>
           <w:rFonts w:ascii="Arial" w:eastAsia="Arial" w:hAnsi="Arial"/>
           <w:sz w:val="20"/>
           <w:szCs w:val="20"/>
@@ -4917,7 +4732,7 @@
           <w:sz w:val="20"/>
           <w:szCs w:val="20"/>
         </w:rPr>
-        <w:t xml:space="preserve">{{prev_atende}}</w:t>
+        <w:t>{{prev_atende}}</w:t>
       </w:r>
       <w:r>
         <w:rPr>
@@ -4962,6 +4777,7 @@
           <w:sz w:val="20"/>
           <w:szCs w:val="20"/>
         </w:rPr>
+        <w:lastRenderedPageBreak/>
         <w:t>Nos casos em que o contrato for firmado entre a Filtrovali e a montadora, porém o faturamento ocorrer diretamente para o Cliente Final, a mobilização ficará condicionada à emissão do pedido de compra pelo Cliente Final</w:t>
       </w:r>
       <w:r>
@@ -5117,7 +4933,7 @@
           <w:sz w:val="20"/>
           <w:szCs w:val="20"/>
         </w:rPr>
-        <w:t xml:space="preserve">{{n_dias}}</w:t>
+        <w:t>{{n_dias}}</w:t>
       </w:r>
       <w:r>
         <w:rPr>
@@ -5161,7 +4977,7 @@
           <w:sz w:val="20"/>
           <w:szCs w:val="20"/>
         </w:rPr>
-        <w:t xml:space="preserve">{{dias_treinamento}}</w:t>
+        <w:t>{{dias_treinamento}}</w:t>
       </w:r>
       <w:r>
         <w:rPr>
@@ -5205,7 +5021,7 @@
           <w:sz w:val="20"/>
           <w:szCs w:val="20"/>
         </w:rPr>
-        <w:t xml:space="preserve">{{n_dias_trabalhados}}</w:t>
+        <w:t>{{n_dias_trabalhados}}</w:t>
       </w:r>
       <w:r>
         <w:rPr>
@@ -5249,7 +5065,7 @@
           <w:sz w:val="20"/>
           <w:szCs w:val="20"/>
         </w:rPr>
-        <w:t xml:space="preserve">{{dias_mob}}</w:t>
+        <w:t>{{dias_mob}}</w:t>
       </w:r>
       <w:r>
         <w:rPr>
@@ -5644,6 +5460,7 @@
           <w:sz w:val="20"/>
           <w:szCs w:val="20"/>
         </w:rPr>
+        <w:lastRenderedPageBreak/>
         <w:t>Obs: Visando a redução de tempo e retrabalho com manutenção de relatórios, os relatórios abaixo só serão elaborados e entregues após a regularização e aprovação dos RDOs.</w:t>
       </w:r>
     </w:p>
@@ -6043,15 +5860,7 @@
           <w:sz w:val="20"/>
           <w:szCs w:val="20"/>
         </w:rPr>
-        <w:t>específicas das atividades, bem como, as imagens do antes e depois de alguns pontos da estrutura</w:t>
-      </w:r>
-      <w:r>
-        <w:rPr>
-          <w:rFonts w:ascii="Arial" w:hAnsi="Arial" w:cs="Arial"/>
-          <w:sz w:val="20"/>
-          <w:szCs w:val="20"/>
-        </w:rPr>
-        <w:t>.</w:t>
+        <w:t>específicas das atividades, bem como, as imagens do antes e depois de alguns pontos da estrutura.</w:t>
       </w:r>
     </w:p>
     <w:p>
@@ -6157,7 +5966,7 @@
           <w:sz w:val="20"/>
           <w:szCs w:val="20"/>
         </w:rPr>
-        <w:t xml:space="preserve">{{validadeProp}}</w:t>
+        <w:t>{{validadeProp}}</w:t>
       </w:r>
       <w:r>
         <w:rPr>
@@ -6270,7 +6079,6 @@
           <w:sz w:val="20"/>
           <w:szCs w:val="20"/>
         </w:rPr>
-        <w:lastRenderedPageBreak/>
         <w:t xml:space="preserve">No caso de prorrogação de prazo conforme item </w:t>
       </w:r>
       <w:r>
@@ -6421,7 +6229,7 @@
 </file>
 
 <file path=word/endnotes.xml><?xml version="1.0" encoding="utf-8"?>
-<w:endnotes xmlns:wpc="http://schemas.microsoft.com/office/word/2010/wordprocessingCanvas" xmlns:cx="http://schemas.microsoft.com/office/drawing/2014/chartex" xmlns:cx1="http://schemas.microsoft.com/office/drawing/2015/9/8/chartex" xmlns:cx2="http://schemas.microsoft.com/office/drawing/2015/10/21/chartex" xmlns:cx3="http://schemas.microsoft.com/office/drawing/2016/5/9/chartex" xmlns:cx4="http://schemas.microsoft.com/office/drawing/2016/5/10/chartex" xmlns:cx5="http://schemas.microsoft.com/office/drawing/2016/5/11/chartex" xmlns:cx6="http://schemas.microsoft.com/office/drawing/2016/5/12/chartex" xmlns:cx7="http://schemas.microsoft.com/office/drawing/2016/5/13/chartex" xmlns:cx8="http://schemas.microsoft.com/office/drawing/2016/5/14/chartex" xmlns:mc="http://schemas.openxmlformats.org/markup-compatibility/2006" xmlns:aink="http://schemas.microsoft.com/office/drawing/2016/ink" xmlns:am3d="http://schemas.microsoft.com/office/drawing/2017/model3d" xmlns:o="urn:schemas-microsoft-com:office:office" xmlns:oel="http://schemas.microsoft.com/office/2019/extlst" xmlns:r="http://schemas.openxmlformats.org/officeDocument/2006/relationships" xmlns:m="http://schemas.openxmlformats.org/officeDocument/2006/math" xmlns:v="urn:schemas-microsoft-com:vml" xmlns:wp14="http://schemas.microsoft.com/office/word/2010/wordprocessingDrawing" xmlns:wp="http://schemas.openxmlformats.org/drawingml/2006/wordprocessingDrawing" xmlns:w10="urn:schemas-microsoft-com:office:word" xmlns:w="http://schemas.openxmlformats.org/wordprocessingml/2006/main" xmlns:w14="http://schemas.microsoft.com/office/word/2010/wordml" xmlns:w15="http://schemas.microsoft.com/office/word/2012/wordml" xmlns:w16cei="http://schemas.microsoft.com/office/word/2026/wordml/cei" xmlns:w16cex="http://schemas.microsoft.com/office/word/2018/wordml/cex" xmlns:w16cid="http://schemas.microsoft.com/office/word/2016/wordml/cid" xmlns:w16="http://schemas.microsoft.com/office/word/2018/wordml" xmlns:w16du="http://schemas.microsoft.com/office/word/2023/wordml/word16du" xmlns:w16sdtdh="http://schemas.microsoft.com/office/word/2020/wordml/sdtdatahash" xmlns:w16sdtfl="http://schemas.microsoft.com/office/word/2024/wordml/sdtformatlock" xmlns:w16se="http://schemas.microsoft.com/office/word/2015/wordml/symex" xmlns:wpg="http://schemas.microsoft.com/office/word/2010/wordprocessingGroup" xmlns:wpi="http://schemas.microsoft.com/office/word/2010/wordprocessingInk" xmlns:wne="http://schemas.microsoft.com/office/word/2006/wordml" xmlns:wps="http://schemas.microsoft.com/office/word/2010/wordprocessingShape" mc:Ignorable="w14 w15 w16se w16cid w16 w16cex w16sdtdh w16sdtfl w16du wp14">
+<w:endnotes xmlns:wpc="http://schemas.microsoft.com/office/word/2010/wordprocessingCanvas" xmlns:cx="http://schemas.microsoft.com/office/drawing/2014/chartex" xmlns:cx1="http://schemas.microsoft.com/office/drawing/2015/9/8/chartex" xmlns:cx2="http://schemas.microsoft.com/office/drawing/2015/10/21/chartex" xmlns:cx3="http://schemas.microsoft.com/office/drawing/2016/5/9/chartex" xmlns:cx4="http://schemas.microsoft.com/office/drawing/2016/5/10/chartex" xmlns:cx5="http://schemas.microsoft.com/office/drawing/2016/5/11/chartex" xmlns:cx6="http://schemas.microsoft.com/office/drawing/2016/5/12/chartex" xmlns:cx7="http://schemas.microsoft.com/office/drawing/2016/5/13/chartex" xmlns:cx8="http://schemas.microsoft.com/office/drawing/2016/5/14/chartex" xmlns:mc="http://schemas.openxmlformats.org/markup-compatibility/2006" xmlns:aink="http://schemas.microsoft.com/office/drawing/2016/ink" xmlns:am3d="http://schemas.microsoft.com/office/drawing/2017/model3d" xmlns:o="urn:schemas-microsoft-com:office:office" xmlns:oel="http://schemas.microsoft.com/office/2019/extlst" xmlns:r="http://schemas.openxmlformats.org/officeDocument/2006/relationships" xmlns:m="http://schemas.openxmlformats.org/officeDocument/2006/math" xmlns:v="urn:schemas-microsoft-com:vml" xmlns:wp14="http://schemas.microsoft.com/office/word/2010/wordprocessingDrawing" xmlns:wp="http://schemas.openxmlformats.org/drawingml/2006/wordprocessingDrawing" xmlns:w10="urn:schemas-microsoft-com:office:word" xmlns:w="http://schemas.openxmlformats.org/wordprocessingml/2006/main" xmlns:w14="http://schemas.microsoft.com/office/word/2010/wordml" xmlns:w15="http://schemas.microsoft.com/office/word/2012/wordml" xmlns:w16cex="http://schemas.microsoft.com/office/word/2018/wordml/cex" xmlns:w16cid="http://schemas.microsoft.com/office/word/2016/wordml/cid" xmlns:w16="http://schemas.microsoft.com/office/word/2018/wordml" xmlns:w16du="http://schemas.microsoft.com/office/word/2023/wordml/word16du" xmlns:w16sdtdh="http://schemas.microsoft.com/office/word/2020/wordml/sdtdatahash" xmlns:w16sdtfl="http://schemas.microsoft.com/office/word/2024/wordml/sdtformatlock" xmlns:w16se="http://schemas.microsoft.com/office/word/2015/wordml/symex" xmlns:wpg="http://schemas.microsoft.com/office/word/2010/wordprocessingGroup" xmlns:wpi="http://schemas.microsoft.com/office/word/2010/wordprocessingInk" xmlns:wne="http://schemas.microsoft.com/office/word/2006/wordml" xmlns:wps="http://schemas.microsoft.com/office/word/2010/wordprocessingShape" mc:Ignorable="w14 w15 w16se w16cid w16 w16cex w16sdtdh w16sdtfl w16du wp14">
   <w:endnote w:type="separator" w:id="-1">
     <w:p>
       <w:pPr>
@@ -6446,7 +6254,7 @@
 </file>
 
 <file path=word/footer1.xml><?xml version="1.0" encoding="utf-8"?>
-<w:ftr xmlns:wpc="http://schemas.microsoft.com/office/word/2010/wordprocessingCanvas" xmlns:cx="http://schemas.microsoft.com/office/drawing/2014/chartex" xmlns:cx1="http://schemas.microsoft.com/office/drawing/2015/9/8/chartex" xmlns:cx2="http://schemas.microsoft.com/office/drawing/2015/10/21/chartex" xmlns:cx3="http://schemas.microsoft.com/office/drawing/2016/5/9/chartex" xmlns:cx4="http://schemas.microsoft.com/office/drawing/2016/5/10/chartex" xmlns:cx5="http://schemas.microsoft.com/office/drawing/2016/5/11/chartex" xmlns:cx6="http://schemas.microsoft.com/office/drawing/2016/5/12/chartex" xmlns:cx7="http://schemas.microsoft.com/office/drawing/2016/5/13/chartex" xmlns:cx8="http://schemas.microsoft.com/office/drawing/2016/5/14/chartex" xmlns:mc="http://schemas.openxmlformats.org/markup-compatibility/2006" xmlns:aink="http://schemas.microsoft.com/office/drawing/2016/ink" xmlns:am3d="http://schemas.microsoft.com/office/drawing/2017/model3d" xmlns:o="urn:schemas-microsoft-com:office:office" xmlns:oel="http://schemas.microsoft.com/office/2019/extlst" xmlns:r="http://schemas.openxmlformats.org/officeDocument/2006/relationships" xmlns:m="http://schemas.openxmlformats.org/officeDocument/2006/math" xmlns:v="urn:schemas-microsoft-com:vml" xmlns:wp14="http://schemas.microsoft.com/office/word/2010/wordprocessingDrawing" xmlns:wp="http://schemas.openxmlformats.org/drawingml/2006/wordprocessingDrawing" xmlns:w10="urn:schemas-microsoft-com:office:word" xmlns:w="http://schemas.openxmlformats.org/wordprocessingml/2006/main" xmlns:w14="http://schemas.microsoft.com/office/word/2010/wordml" xmlns:w15="http://schemas.microsoft.com/office/word/2012/wordml" xmlns:w16cei="http://schemas.microsoft.com/office/word/2026/wordml/cei" xmlns:w16cex="http://schemas.microsoft.com/office/word/2018/wordml/cex" xmlns:w16cid="http://schemas.microsoft.com/office/word/2016/wordml/cid" xmlns:w16="http://schemas.microsoft.com/office/word/2018/wordml" xmlns:w16du="http://schemas.microsoft.com/office/word/2023/wordml/word16du" xmlns:w16sdtdh="http://schemas.microsoft.com/office/word/2020/wordml/sdtdatahash" xmlns:w16sdtfl="http://schemas.microsoft.com/office/word/2024/wordml/sdtformatlock" xmlns:w16se="http://schemas.microsoft.com/office/word/2015/wordml/symex" xmlns:wpg="http://schemas.microsoft.com/office/word/2010/wordprocessingGroup" xmlns:wpi="http://schemas.microsoft.com/office/word/2010/wordprocessingInk" xmlns:wne="http://schemas.microsoft.com/office/word/2006/wordml" xmlns:wps="http://schemas.microsoft.com/office/word/2010/wordprocessingShape" mc:Ignorable="w14 w15 w16se w16cid w16 w16cex w16sdtdh w16sdtfl w16du wp14">
+<w:ftr xmlns:wpc="http://schemas.microsoft.com/office/word/2010/wordprocessingCanvas" xmlns:cx="http://schemas.microsoft.com/office/drawing/2014/chartex" xmlns:cx1="http://schemas.microsoft.com/office/drawing/2015/9/8/chartex" xmlns:cx2="http://schemas.microsoft.com/office/drawing/2015/10/21/chartex" xmlns:cx3="http://schemas.microsoft.com/office/drawing/2016/5/9/chartex" xmlns:cx4="http://schemas.microsoft.com/office/drawing/2016/5/10/chartex" xmlns:cx5="http://schemas.microsoft.com/office/drawing/2016/5/11/chartex" xmlns:cx6="http://schemas.microsoft.com/office/drawing/2016/5/12/chartex" xmlns:cx7="http://schemas.microsoft.com/office/drawing/2016/5/13/chartex" xmlns:cx8="http://schemas.microsoft.com/office/drawing/2016/5/14/chartex" xmlns:mc="http://schemas.openxmlformats.org/markup-compatibility/2006" xmlns:aink="http://schemas.microsoft.com/office/drawing/2016/ink" xmlns:am3d="http://schemas.microsoft.com/office/drawing/2017/model3d" xmlns:o="urn:schemas-microsoft-com:office:office" xmlns:oel="http://schemas.microsoft.com/office/2019/extlst" xmlns:r="http://schemas.openxmlformats.org/officeDocument/2006/relationships" xmlns:m="http://schemas.openxmlformats.org/officeDocument/2006/math" xmlns:v="urn:schemas-microsoft-com:vml" xmlns:wp14="http://schemas.microsoft.com/office/word/2010/wordprocessingDrawing" xmlns:wp="http://schemas.openxmlformats.org/drawingml/2006/wordprocessingDrawing" xmlns:w10="urn:schemas-microsoft-com:office:word" xmlns:w="http://schemas.openxmlformats.org/wordprocessingml/2006/main" xmlns:w14="http://schemas.microsoft.com/office/word/2010/wordml" xmlns:w15="http://schemas.microsoft.com/office/word/2012/wordml" xmlns:w16cex="http://schemas.microsoft.com/office/word/2018/wordml/cex" xmlns:w16cid="http://schemas.microsoft.com/office/word/2016/wordml/cid" xmlns:w16="http://schemas.microsoft.com/office/word/2018/wordml" xmlns:w16du="http://schemas.microsoft.com/office/word/2023/wordml/word16du" xmlns:w16sdtdh="http://schemas.microsoft.com/office/word/2020/wordml/sdtdatahash" xmlns:w16sdtfl="http://schemas.microsoft.com/office/word/2024/wordml/sdtformatlock" xmlns:w16se="http://schemas.microsoft.com/office/word/2015/wordml/symex" xmlns:wpg="http://schemas.microsoft.com/office/word/2010/wordprocessingGroup" xmlns:wpi="http://schemas.microsoft.com/office/word/2010/wordprocessingInk" xmlns:wne="http://schemas.microsoft.com/office/word/2006/wordml" xmlns:wps="http://schemas.microsoft.com/office/word/2010/wordprocessingShape" mc:Ignorable="w14 w15 w16se w16cid w16 w16cex w16sdtdh w16sdtfl w16du wp14">
   <w:sdt>
     <w:sdtPr>
       <w:id w:val="-1433276875"/>
@@ -6501,7 +6309,7 @@
 </file>
 
 <file path=word/footnotes.xml><?xml version="1.0" encoding="utf-8"?>
-<w:footnotes xmlns:wpc="http://schemas.microsoft.com/office/word/2010/wordprocessingCanvas" xmlns:cx="http://schemas.microsoft.com/office/drawing/2014/chartex" xmlns:cx1="http://schemas.microsoft.com/office/drawing/2015/9/8/chartex" xmlns:cx2="http://schemas.microsoft.com/office/drawing/2015/10/21/chartex" xmlns:cx3="http://schemas.microsoft.com/office/drawing/2016/5/9/chartex" xmlns:cx4="http://schemas.microsoft.com/office/drawing/2016/5/10/chartex" xmlns:cx5="http://schemas.microsoft.com/office/drawing/2016/5/11/chartex" xmlns:cx6="http://schemas.microsoft.com/office/drawing/2016/5/12/chartex" xmlns:cx7="http://schemas.microsoft.com/office/drawing/2016/5/13/chartex" xmlns:cx8="http://schemas.microsoft.com/office/drawing/2016/5/14/chartex" xmlns:mc="http://schemas.openxmlformats.org/markup-compatibility/2006" xmlns:aink="http://schemas.microsoft.com/office/drawing/2016/ink" xmlns:am3d="http://schemas.microsoft.com/office/drawing/2017/model3d" xmlns:o="urn:schemas-microsoft-com:office:office" xmlns:oel="http://schemas.microsoft.com/office/2019/extlst" xmlns:r="http://schemas.openxmlformats.org/officeDocument/2006/relationships" xmlns:m="http://schemas.openxmlformats.org/officeDocument/2006/math" xmlns:v="urn:schemas-microsoft-com:vml" xmlns:wp14="http://schemas.microsoft.com/office/word/2010/wordprocessingDrawing" xmlns:wp="http://schemas.openxmlformats.org/drawingml/2006/wordprocessingDrawing" xmlns:w10="urn:schemas-microsoft-com:office:word" xmlns:w="http://schemas.openxmlformats.org/wordprocessingml/2006/main" xmlns:w14="http://schemas.microsoft.com/office/word/2010/wordml" xmlns:w15="http://schemas.microsoft.com/office/word/2012/wordml" xmlns:w16cei="http://schemas.microsoft.com/office/word/2026/wordml/cei" xmlns:w16cex="http://schemas.microsoft.com/office/word/2018/wordml/cex" xmlns:w16cid="http://schemas.microsoft.com/office/word/2016/wordml/cid" xmlns:w16="http://schemas.microsoft.com/office/word/2018/wordml" xmlns:w16du="http://schemas.microsoft.com/office/word/2023/wordml/word16du" xmlns:w16sdtdh="http://schemas.microsoft.com/office/word/2020/wordml/sdtdatahash" xmlns:w16sdtfl="http://schemas.microsoft.com/office/word/2024/wordml/sdtformatlock" xmlns:w16se="http://schemas.microsoft.com/office/word/2015/wordml/symex" xmlns:wpg="http://schemas.microsoft.com/office/word/2010/wordprocessingGroup" xmlns:wpi="http://schemas.microsoft.com/office/word/2010/wordprocessingInk" xmlns:wne="http://schemas.microsoft.com/office/word/2006/wordml" xmlns:wps="http://schemas.microsoft.com/office/word/2010/wordprocessingShape" mc:Ignorable="w14 w15 w16se w16cid w16 w16cex w16sdtdh w16sdtfl w16du wp14">
+<w:footnotes xmlns:wpc="http://schemas.microsoft.com/office/word/2010/wordprocessingCanvas" xmlns:cx="http://schemas.microsoft.com/office/drawing/2014/chartex" xmlns:cx1="http://schemas.microsoft.com/office/drawing/2015/9/8/chartex" xmlns:cx2="http://schemas.microsoft.com/office/drawing/2015/10/21/chartex" xmlns:cx3="http://schemas.microsoft.com/office/drawing/2016/5/9/chartex" xmlns:cx4="http://schemas.microsoft.com/office/drawing/2016/5/10/chartex" xmlns:cx5="http://schemas.microsoft.com/office/drawing/2016/5/11/chartex" xmlns:cx6="http://schemas.microsoft.com/office/drawing/2016/5/12/chartex" xmlns:cx7="http://schemas.microsoft.com/office/drawing/2016/5/13/chartex" xmlns:cx8="http://schemas.microsoft.com/office/drawing/2016/5/14/chartex" xmlns:mc="http://schemas.openxmlformats.org/markup-compatibility/2006" xmlns:aink="http://schemas.microsoft.com/office/drawing/2016/ink" xmlns:am3d="http://schemas.microsoft.com/office/drawing/2017/model3d" xmlns:o="urn:schemas-microsoft-com:office:office" xmlns:oel="http://schemas.microsoft.com/office/2019/extlst" xmlns:r="http://schemas.openxmlformats.org/officeDocument/2006/relationships" xmlns:m="http://schemas.openxmlformats.org/officeDocument/2006/math" xmlns:v="urn:schemas-microsoft-com:vml" xmlns:wp14="http://schemas.microsoft.com/office/word/2010/wordprocessingDrawing" xmlns:wp="http://schemas.openxmlformats.org/drawingml/2006/wordprocessingDrawing" xmlns:w10="urn:schemas-microsoft-com:office:word" xmlns:w="http://schemas.openxmlformats.org/wordprocessingml/2006/main" xmlns:w14="http://schemas.microsoft.com/office/word/2010/wordml" xmlns:w15="http://schemas.microsoft.com/office/word/2012/wordml" xmlns:w16cex="http://schemas.microsoft.com/office/word/2018/wordml/cex" xmlns:w16cid="http://schemas.microsoft.com/office/word/2016/wordml/cid" xmlns:w16="http://schemas.microsoft.com/office/word/2018/wordml" xmlns:w16du="http://schemas.microsoft.com/office/word/2023/wordml/word16du" xmlns:w16sdtdh="http://schemas.microsoft.com/office/word/2020/wordml/sdtdatahash" xmlns:w16sdtfl="http://schemas.microsoft.com/office/word/2024/wordml/sdtformatlock" xmlns:w16se="http://schemas.microsoft.com/office/word/2015/wordml/symex" xmlns:wpg="http://schemas.microsoft.com/office/word/2010/wordprocessingGroup" xmlns:wpi="http://schemas.microsoft.com/office/word/2010/wordprocessingInk" xmlns:wne="http://schemas.microsoft.com/office/word/2006/wordml" xmlns:wps="http://schemas.microsoft.com/office/word/2010/wordprocessingShape" mc:Ignorable="w14 w15 w16se w16cid w16 w16cex w16sdtdh w16sdtfl w16du wp14">
   <w:footnote w:type="separator" w:id="-1">
     <w:p>
       <w:pPr>
@@ -6526,20 +6334,20 @@
 </file>
 
 <file path=word/header1.xml><?xml version="1.0" encoding="utf-8"?>
-<w:hdr xmlns:wpc="http://schemas.microsoft.com/office/word/2010/wordprocessingCanvas" xmlns:cx="http://schemas.microsoft.com/office/drawing/2014/chartex" xmlns:cx1="http://schemas.microsoft.com/office/drawing/2015/9/8/chartex" xmlns:cx2="http://schemas.microsoft.com/office/drawing/2015/10/21/chartex" xmlns:cx3="http://schemas.microsoft.com/office/drawing/2016/5/9/chartex" xmlns:cx4="http://schemas.microsoft.com/office/drawing/2016/5/10/chartex" xmlns:cx5="http://schemas.microsoft.com/office/drawing/2016/5/11/chartex" xmlns:cx6="http://schemas.microsoft.com/office/drawing/2016/5/12/chartex" xmlns:cx7="http://schemas.microsoft.com/office/drawing/2016/5/13/chartex" xmlns:cx8="http://schemas.microsoft.com/office/drawing/2016/5/14/chartex" xmlns:mc="http://schemas.openxmlformats.org/markup-compatibility/2006" xmlns:aink="http://schemas.microsoft.com/office/drawing/2016/ink" xmlns:am3d="http://schemas.microsoft.com/office/drawing/2017/model3d" xmlns:o="urn:schemas-microsoft-com:office:office" xmlns:oel="http://schemas.microsoft.com/office/2019/extlst" xmlns:r="http://schemas.openxmlformats.org/officeDocument/2006/relationships" xmlns:m="http://schemas.openxmlformats.org/officeDocument/2006/math" xmlns:v="urn:schemas-microsoft-com:vml" xmlns:wp14="http://schemas.microsoft.com/office/word/2010/wordprocessingDrawing" xmlns:wp="http://schemas.openxmlformats.org/drawingml/2006/wordprocessingDrawing" xmlns:w10="urn:schemas-microsoft-com:office:word" xmlns:w="http://schemas.openxmlformats.org/wordprocessingml/2006/main" xmlns:w14="http://schemas.microsoft.com/office/word/2010/wordml" xmlns:w15="http://schemas.microsoft.com/office/word/2012/wordml" xmlns:w16cei="http://schemas.microsoft.com/office/word/2026/wordml/cei" xmlns:w16cex="http://schemas.microsoft.com/office/word/2018/wordml/cex" xmlns:w16cid="http://schemas.microsoft.com/office/word/2016/wordml/cid" xmlns:w16="http://schemas.microsoft.com/office/word/2018/wordml" xmlns:w16du="http://schemas.microsoft.com/office/word/2023/wordml/word16du" xmlns:w16sdtdh="http://schemas.microsoft.com/office/word/2020/wordml/sdtdatahash" xmlns:w16sdtfl="http://schemas.microsoft.com/office/word/2024/wordml/sdtformatlock" xmlns:w16se="http://schemas.microsoft.com/office/word/2015/wordml/symex" xmlns:wpg="http://schemas.microsoft.com/office/word/2010/wordprocessingGroup" xmlns:wpi="http://schemas.microsoft.com/office/word/2010/wordprocessingInk" xmlns:wne="http://schemas.microsoft.com/office/word/2006/wordml" xmlns:wps="http://schemas.microsoft.com/office/word/2010/wordprocessingShape" mc:Ignorable="w14 w15 w16se w16cid w16 w16cex w16sdtdh w16sdtfl w16du wp14">
+<w:hdr xmlns:wpc="http://schemas.microsoft.com/office/word/2010/wordprocessingCanvas" xmlns:cx="http://schemas.microsoft.com/office/drawing/2014/chartex" xmlns:cx1="http://schemas.microsoft.com/office/drawing/2015/9/8/chartex" xmlns:cx2="http://schemas.microsoft.com/office/drawing/2015/10/21/chartex" xmlns:cx3="http://schemas.microsoft.com/office/drawing/2016/5/9/chartex" xmlns:cx4="http://schemas.microsoft.com/office/drawing/2016/5/10/chartex" xmlns:cx5="http://schemas.microsoft.com/office/drawing/2016/5/11/chartex" xmlns:cx6="http://schemas.microsoft.com/office/drawing/2016/5/12/chartex" xmlns:cx7="http://schemas.microsoft.com/office/drawing/2016/5/13/chartex" xmlns:cx8="http://schemas.microsoft.com/office/drawing/2016/5/14/chartex" xmlns:mc="http://schemas.openxmlformats.org/markup-compatibility/2006" xmlns:aink="http://schemas.microsoft.com/office/drawing/2016/ink" xmlns:am3d="http://schemas.microsoft.com/office/drawing/2017/model3d" xmlns:o="urn:schemas-microsoft-com:office:office" xmlns:oel="http://schemas.microsoft.com/office/2019/extlst" xmlns:r="http://schemas.openxmlformats.org/officeDocument/2006/relationships" xmlns:m="http://schemas.openxmlformats.org/officeDocument/2006/math" xmlns:v="urn:schemas-microsoft-com:vml" xmlns:wp14="http://schemas.microsoft.com/office/word/2010/wordprocessingDrawing" xmlns:wp="http://schemas.openxmlformats.org/drawingml/2006/wordprocessingDrawing" xmlns:w10="urn:schemas-microsoft-com:office:word" xmlns:w="http://schemas.openxmlformats.org/wordprocessingml/2006/main" xmlns:w14="http://schemas.microsoft.com/office/word/2010/wordml" xmlns:w15="http://schemas.microsoft.com/office/word/2012/wordml" xmlns:w16cex="http://schemas.microsoft.com/office/word/2018/wordml/cex" xmlns:w16cid="http://schemas.microsoft.com/office/word/2016/wordml/cid" xmlns:w16="http://schemas.microsoft.com/office/word/2018/wordml" xmlns:w16du="http://schemas.microsoft.com/office/word/2023/wordml/word16du" xmlns:w16sdtdh="http://schemas.microsoft.com/office/word/2020/wordml/sdtdatahash" xmlns:w16sdtfl="http://schemas.microsoft.com/office/word/2024/wordml/sdtformatlock" xmlns:w16se="http://schemas.microsoft.com/office/word/2015/wordml/symex" xmlns:wpg="http://schemas.microsoft.com/office/word/2010/wordprocessingGroup" xmlns:wpi="http://schemas.microsoft.com/office/word/2010/wordprocessingInk" xmlns:wne="http://schemas.microsoft.com/office/word/2006/wordml" xmlns:wps="http://schemas.microsoft.com/office/word/2010/wordprocessingShape" mc:Ignorable="w14 w15 w16se w16cid w16 w16cex w16sdtdh w16sdtfl w16du wp14">
   <w:p>
     <w:pPr>
       <w:autoSpaceDE w:val="0"/>
       <w:autoSpaceDN w:val="0"/>
       <w:adjustRightInd w:val="0"/>
       <w:spacing w:after="0" w:line="240" w:lineRule="auto"/>
+      <w:jc w:val="right"/>
       <w:rPr>
         <w:rFonts w:ascii="Arial" w:hAnsi="Arial" w:cs="Arial"/>
         <w:b/>
         <w:sz w:val="26"/>
         <w:szCs w:val="26"/>
       </w:rPr>
-      <w:jc w:val="right"/>
     </w:pPr>
     <w:r>
       <w:rPr>
@@ -6614,7 +6422,7 @@
         <w:sz w:val="20"/>
         <w:szCs w:val="20"/>
       </w:rPr>
-      <w:t xml:space="preserve">{{data_texto}}</w:t>
+      <w:t>{{data_texto}}</w:t>
     </w:r>
   </w:p>
   <w:p>
@@ -6642,7 +6450,7 @@
 </file>
 
 <file path=word/numbering.xml><?xml version="1.0" encoding="utf-8"?>
-<w:numbering xmlns:wpc="http://schemas.microsoft.com/office/word/2010/wordprocessingCanvas" xmlns:cx="http://schemas.microsoft.com/office/drawing/2014/chartex" xmlns:cx1="http://schemas.microsoft.com/office/drawing/2015/9/8/chartex" xmlns:cx2="http://schemas.microsoft.com/office/drawing/2015/10/21/chartex" xmlns:cx3="http://schemas.microsoft.com/office/drawing/2016/5/9/chartex" xmlns:cx4="http://schemas.microsoft.com/office/drawing/2016/5/10/chartex" xmlns:cx5="http://schemas.microsoft.com/office/drawing/2016/5/11/chartex" xmlns:cx6="http://schemas.microsoft.com/office/drawing/2016/5/12/chartex" xmlns:cx7="http://schemas.microsoft.com/office/drawing/2016/5/13/chartex" xmlns:cx8="http://schemas.microsoft.com/office/drawing/2016/5/14/chartex" xmlns:mc="http://schemas.openxmlformats.org/markup-compatibility/2006" xmlns:aink="http://schemas.microsoft.com/office/drawing/2016/ink" xmlns:am3d="http://schemas.microsoft.com/office/drawing/2017/model3d" xmlns:o="urn:schemas-microsoft-com:office:office" xmlns:oel="http://schemas.microsoft.com/office/2019/extlst" xmlns:r="http://schemas.openxmlformats.org/officeDocument/2006/relationships" xmlns:m="http://schemas.openxmlformats.org/officeDocument/2006/math" xmlns:v="urn:schemas-microsoft-com:vml" xmlns:wp14="http://schemas.microsoft.com/office/word/2010/wordprocessingDrawing" xmlns:wp="http://schemas.openxmlformats.org/drawingml/2006/wordprocessingDrawing" xmlns:w10="urn:schemas-microsoft-com:office:word" xmlns:w="http://schemas.openxmlformats.org/wordprocessingml/2006/main" xmlns:w14="http://schemas.microsoft.com/office/word/2010/wordml" xmlns:w15="http://schemas.microsoft.com/office/word/2012/wordml" xmlns:w16cei="http://schemas.microsoft.com/office/word/2026/wordml/cei" xmlns:w16cex="http://schemas.microsoft.com/office/word/2018/wordml/cex" xmlns:w16cid="http://schemas.microsoft.com/office/word/2016/wordml/cid" xmlns:w16="http://schemas.microsoft.com/office/word/2018/wordml" xmlns:w16du="http://schemas.microsoft.com/office/word/2023/wordml/word16du" xmlns:w16sdtdh="http://schemas.microsoft.com/office/word/2020/wordml/sdtdatahash" xmlns:w16sdtfl="http://schemas.microsoft.com/office/word/2024/wordml/sdtformatlock" xmlns:w16se="http://schemas.microsoft.com/office/word/2015/wordml/symex" xmlns:wpg="http://schemas.microsoft.com/office/word/2010/wordprocessingGroup" xmlns:wpi="http://schemas.microsoft.com/office/word/2010/wordprocessingInk" xmlns:wne="http://schemas.microsoft.com/office/word/2006/wordml" xmlns:wps="http://schemas.microsoft.com/office/word/2010/wordprocessingShape" mc:Ignorable="w14 w15 w16se w16cid w16 w16cex w16sdtdh w16sdtfl w16du wp14">
+<w:numbering xmlns:wpc="http://schemas.microsoft.com/office/word/2010/wordprocessingCanvas" xmlns:cx="http://schemas.microsoft.com/office/drawing/2014/chartex" xmlns:cx1="http://schemas.microsoft.com/office/drawing/2015/9/8/chartex" xmlns:cx2="http://schemas.microsoft.com/office/drawing/2015/10/21/chartex" xmlns:cx3="http://schemas.microsoft.com/office/drawing/2016/5/9/chartex" xmlns:cx4="http://schemas.microsoft.com/office/drawing/2016/5/10/chartex" xmlns:cx5="http://schemas.microsoft.com/office/drawing/2016/5/11/chartex" xmlns:cx6="http://schemas.microsoft.com/office/drawing/2016/5/12/chartex" xmlns:cx7="http://schemas.microsoft.com/office/drawing/2016/5/13/chartex" xmlns:cx8="http://schemas.microsoft.com/office/drawing/2016/5/14/chartex" xmlns:mc="http://schemas.openxmlformats.org/markup-compatibility/2006" xmlns:aink="http://schemas.microsoft.com/office/drawing/2016/ink" xmlns:am3d="http://schemas.microsoft.com/office/drawing/2017/model3d" xmlns:o="urn:schemas-microsoft-com:office:office" xmlns:oel="http://schemas.microsoft.com/office/2019/extlst" xmlns:r="http://schemas.openxmlformats.org/officeDocument/2006/relationships" xmlns:m="http://schemas.openxmlformats.org/officeDocument/2006/math" xmlns:v="urn:schemas-microsoft-com:vml" xmlns:wp14="http://schemas.microsoft.com/office/word/2010/wordprocessingDrawing" xmlns:wp="http://schemas.openxmlformats.org/drawingml/2006/wordprocessingDrawing" xmlns:w10="urn:schemas-microsoft-com:office:word" xmlns:w="http://schemas.openxmlformats.org/wordprocessingml/2006/main" xmlns:w14="http://schemas.microsoft.com/office/word/2010/wordml" xmlns:w15="http://schemas.microsoft.com/office/word/2012/wordml" xmlns:w16cex="http://schemas.microsoft.com/office/word/2018/wordml/cex" xmlns:w16cid="http://schemas.microsoft.com/office/word/2016/wordml/cid" xmlns:w16="http://schemas.microsoft.com/office/word/2018/wordml" xmlns:w16du="http://schemas.microsoft.com/office/word/2023/wordml/word16du" xmlns:w16sdtdh="http://schemas.microsoft.com/office/word/2020/wordml/sdtdatahash" xmlns:w16sdtfl="http://schemas.microsoft.com/office/word/2024/wordml/sdtformatlock" xmlns:w16se="http://schemas.microsoft.com/office/word/2015/wordml/symex" xmlns:wpg="http://schemas.microsoft.com/office/word/2010/wordprocessingGroup" xmlns:wpi="http://schemas.microsoft.com/office/word/2010/wordprocessingInk" xmlns:wne="http://schemas.microsoft.com/office/word/2006/wordml" xmlns:wps="http://schemas.microsoft.com/office/word/2010/wordprocessingShape" mc:Ignorable="w14 w15 w16se w16cid w16 w16cex w16sdtdh w16sdtfl w16du wp14">
   <w:abstractNum w:abstractNumId="0" w15:restartNumberingAfterBreak="0">
     <w:nsid w:val="067270B8"/>
     <w:multiLevelType w:val="hybridMultilevel"/>
@@ -8338,10 +8146,22 @@
 </file>
 
 <file path=customXml/item1.xml><?xml version="1.0" encoding="utf-8"?>
+<p:properties xmlns:p="http://schemas.microsoft.com/office/2006/metadata/properties" xmlns:xsi="http://www.w3.org/2001/XMLSchema-instance" xmlns:pc="http://schemas.microsoft.com/office/infopath/2007/PartnerControls">
+  <documentManagement>
+    <lcf76f155ced4ddcb4097134ff3c332f xmlns="5ebac46c-3801-4f50-8d40-ff19a3d08a31">
+      <Terms xmlns="http://schemas.microsoft.com/office/infopath/2007/PartnerControls"/>
+    </lcf76f155ced4ddcb4097134ff3c332f>
+    <TaxCatchAll xmlns="04f7cffc-3ea8-4655-aac6-2c812ca3e62f" xsi:nil="true"/>
+    <CodigoDoc xmlns="5ebac46c-3801-4f50-8d40-ff19a3d08a31" xsi:nil="true"/>
+  </documentManagement>
+</p:properties>
+</file>
+
+<file path=customXml/item2.xml><?xml version="1.0" encoding="utf-8"?>
 <b:Sources xmlns:b="http://schemas.openxmlformats.org/officeDocument/2006/bibliography" xmlns="http://schemas.openxmlformats.org/officeDocument/2006/bibliography" SelectedStyle="\APASixthEditionOfficeOnline.xsl" StyleName="APA" Version="6"/>
 </file>
 
-<file path=customXml/item2.xml><?xml version="1.0" encoding="utf-8"?>
+<file path=customXml/item3.xml><?xml version="1.0" encoding="utf-8"?>
 <ct:contentTypeSchema xmlns:ct="http://schemas.microsoft.com/office/2006/metadata/contentType" xmlns:ma="http://schemas.microsoft.com/office/2006/metadata/properties/metaAttributes" ct:_="" ma:_="" ma:contentTypeName="Documento" ma:contentTypeID="0x01010050D375E88928F94091E6FD7AA4E06D15" ma:contentTypeVersion="13" ma:contentTypeDescription="Crie um novo documento." ma:contentTypeScope="" ma:versionID="7df79d7f540b57f8739ecf349a4839bc">
   <xsd:schema xmlns:xsd="http://www.w3.org/2001/XMLSchema" xmlns:xs="http://www.w3.org/2001/XMLSchema" xmlns:p="http://schemas.microsoft.com/office/2006/metadata/properties" xmlns:ns2="5ebac46c-3801-4f50-8d40-ff19a3d08a31" xmlns:ns3="04f7cffc-3ea8-4655-aac6-2c812ca3e62f" targetNamespace="http://schemas.microsoft.com/office/2006/metadata/properties" ma:root="true" ma:fieldsID="096b32e32a0a7c12d0d47f4c83d7cab2" ns2:_="" ns3:_="">
     <xsd:import namespace="5ebac46c-3801-4f50-8d40-ff19a3d08a31"/>
@@ -8550,7 +8370,7 @@
 </ct:contentTypeSchema>
 </file>
 
-<file path=customXml/item3.xml><?xml version="1.0" encoding="utf-8"?>
+<file path=customXml/item4.xml><?xml version="1.0" encoding="utf-8"?>
 <?mso-contentType ?>
 <FormTemplates xmlns="http://schemas.microsoft.com/sharepoint/v3/contenttype/forms">
   <Display>DocumentLibraryForm</Display>
@@ -8559,19 +8379,18 @@
 </FormTemplates>
 </file>
 
-<file path=customXml/item4.xml><?xml version="1.0" encoding="utf-8"?>
-<p:properties xmlns:p="http://schemas.microsoft.com/office/2006/metadata/properties" xmlns:xsi="http://www.w3.org/2001/XMLSchema-instance" xmlns:pc="http://schemas.microsoft.com/office/infopath/2007/PartnerControls">
-  <documentManagement>
-    <lcf76f155ced4ddcb4097134ff3c332f xmlns="5ebac46c-3801-4f50-8d40-ff19a3d08a31">
-      <Terms xmlns="http://schemas.microsoft.com/office/infopath/2007/PartnerControls"/>
-    </lcf76f155ced4ddcb4097134ff3c332f>
-    <TaxCatchAll xmlns="04f7cffc-3ea8-4655-aac6-2c812ca3e62f" xsi:nil="true"/>
-    <CodigoDoc xmlns="5ebac46c-3801-4f50-8d40-ff19a3d08a31" xsi:nil="true"/>
-  </documentManagement>
-</p:properties>
+<file path=customXml/itemProps1.xml><?xml version="1.0" encoding="utf-8"?>
+<ds:datastoreItem xmlns:ds="http://schemas.openxmlformats.org/officeDocument/2006/customXml" ds:itemID="{BDD202C9-EE0D-44AA-BA2D-EDA98CFA438C}">
+  <ds:schemaRefs>
+    <ds:schemaRef ds:uri="http://schemas.microsoft.com/office/2006/metadata/properties"/>
+    <ds:schemaRef ds:uri="http://schemas.microsoft.com/office/infopath/2007/PartnerControls"/>
+    <ds:schemaRef ds:uri="5ebac46c-3801-4f50-8d40-ff19a3d08a31"/>
+    <ds:schemaRef ds:uri="04f7cffc-3ea8-4655-aac6-2c812ca3e62f"/>
+  </ds:schemaRefs>
+</ds:datastoreItem>
 </file>
 
-<file path=customXml/itemProps1.xml><?xml version="1.0" encoding="utf-8"?>
+<file path=customXml/itemProps2.xml><?xml version="1.0" encoding="utf-8"?>
 <ds:datastoreItem xmlns:ds="http://schemas.openxmlformats.org/officeDocument/2006/customXml" ds:itemID="{AB0B6225-2C28-4B59-AC07-D3905D9EBCC2}">
   <ds:schemaRefs>
     <ds:schemaRef ds:uri="http://schemas.openxmlformats.org/officeDocument/2006/bibliography"/>
@@ -8579,7 +8398,7 @@
 </ds:datastoreItem>
 </file>
 
-<file path=customXml/itemProps2.xml><?xml version="1.0" encoding="utf-8"?>
+<file path=customXml/itemProps3.xml><?xml version="1.0" encoding="utf-8"?>
 <ds:datastoreItem xmlns:ds="http://schemas.openxmlformats.org/officeDocument/2006/customXml" ds:itemID="{94A65DC0-273F-470F-8FFD-06309A34330A}">
   <ds:schemaRefs>
     <ds:schemaRef ds:uri="http://schemas.microsoft.com/office/2006/metadata/contentType"/>
@@ -8598,21 +8417,10 @@
 </ds:datastoreItem>
 </file>
 
-<file path=customXml/itemProps3.xml><?xml version="1.0" encoding="utf-8"?>
+<file path=customXml/itemProps4.xml><?xml version="1.0" encoding="utf-8"?>
 <ds:datastoreItem xmlns:ds="http://schemas.openxmlformats.org/officeDocument/2006/customXml" ds:itemID="{A5E54D8B-0784-4B0D-BAB7-E874556CC73D}">
   <ds:schemaRefs>
     <ds:schemaRef ds:uri="http://schemas.microsoft.com/sharepoint/v3/contenttype/forms"/>
   </ds:schemaRefs>
 </ds:datastoreItem>
-</file>
-
-<file path=customXml/itemProps4.xml><?xml version="1.0" encoding="utf-8"?>
-<ds:datastoreItem xmlns:ds="http://schemas.openxmlformats.org/officeDocument/2006/customXml" ds:itemID="{BDD202C9-EE0D-44AA-BA2D-EDA98CFA438C}">
-  <ds:schemaRefs>
-    <ds:schemaRef ds:uri="http://schemas.microsoft.com/office/2006/metadata/properties"/>
-    <ds:schemaRef ds:uri="http://schemas.microsoft.com/office/infopath/2007/PartnerControls"/>
-    <ds:schemaRef ds:uri="5ebac46c-3801-4f50-8d40-ff19a3d08a31"/>
-    <ds:schemaRef ds:uri="04f7cffc-3ea8-4655-aac6-2c812ca3e62f"/>
-  </ds:schemaRefs>
-</ds:datastoreItem>
 </file>
</xml_diff>